<commit_message>
Prepare 1.0.0 release documentation and screenshots
</commit_message>
<xml_diff>
--- a/docs/help/RBC Community Map Help.docx
+++ b/docs/help/RBC Community Map Help.docx
@@ -23,9 +23,7 @@
       </w:r>
     </w:p>
     <w:p>
-      <w:r>
-        <w:br w:type="page"/>
-      </w:r>
+      <w:r/>
     </w:p>
     <w:p>
       <w:pPr>
@@ -51,8 +49,7 @@
         <w:rPr>
           <w:sz w:val="1"/>
         </w:rPr>
-        <w:lastRenderedPageBreak/>
-        <w:br w:type="textWrapping" w:clear="all"/>
+        <w:br/>
       </w:r>
       <w:bookmarkStart w:id="0" w:name="_Toc197162288"/>
       <w:r>
@@ -7107,9 +7104,7 @@
       </w:sdtContent>
     </w:sdt>
     <w:p>
-      <w:r>
-        <w:br w:type="page"/>
-      </w:r>
+      <w:r/>
     </w:p>
     <w:p>
       <w:pPr>
@@ -7135,8 +7130,7 @@
         <w:rPr>
           <w:sz w:val="1"/>
         </w:rPr>
-        <w:lastRenderedPageBreak/>
-        <w:br w:type="textWrapping" w:clear="all"/>
+        <w:br/>
       </w:r>
       <w:bookmarkStart w:id="1" w:name="_topic_Overview"/>
       <w:bookmarkStart w:id="2" w:name="_Toc197162289"/>
@@ -7192,7 +7186,7 @@
           <w:rFonts w:ascii="Times New Roman" w:eastAsia="Times New Roman" w:hAnsi="Times New Roman" w:cs="Times New Roman"/>
           <w:color w:val="000000"/>
         </w:rPr>
-        <w:t> is a companion application for the browser-based vampire game </w:t>
+        <w:t xml:space="preserve"> is a companion application for the browser-based vampire game </w:t>
       </w:r>
       <w:hyperlink r:id="rId8">
         <w:r>
@@ -7301,7 +7295,7 @@
           <w:rFonts w:ascii="Times New Roman" w:eastAsia="Times New Roman" w:hAnsi="Times New Roman" w:cs="Times New Roman"/>
           <w:color w:val="000000"/>
         </w:rPr>
-        <w:t> – Learn the structure of the main window and how each section works together.</w:t>
+        <w:t xml:space="preserve"> – Learn the structure of the main window and how each section works together.</w:t>
       </w:r>
     </w:p>
     <w:p>
@@ -7336,7 +7330,7 @@
           <w:rFonts w:ascii="Times New Roman" w:eastAsia="Times New Roman" w:hAnsi="Times New Roman" w:cs="Times New Roman"/>
           <w:color w:val="000000"/>
         </w:rPr>
-        <w:t> – How to view your location, navigate the grid, and use destination planning tools.</w:t>
+        <w:t xml:space="preserve"> – How to view your location, navigate the grid, and use destination planning tools.</w:t>
       </w:r>
     </w:p>
     <w:p>
@@ -7361,7 +7355,7 @@
           <w:rFonts w:ascii="Times New Roman" w:eastAsia="Times New Roman" w:hAnsi="Times New Roman" w:cs="Times New Roman"/>
           <w:color w:val="000000"/>
         </w:rPr>
-        <w:t> – Full breakdown of all items in the File, Settings, Tools, Resources, and Help menus.</w:t>
+        <w:t xml:space="preserve"> – Full breakdown of all items in the File, Settings, Tools, Resources, and Help menus.</w:t>
       </w:r>
     </w:p>
     <w:p>
@@ -7387,7 +7381,7 @@
           <w:rFonts w:ascii="Times New Roman" w:eastAsia="Times New Roman" w:hAnsi="Times New Roman" w:cs="Times New Roman"/>
           <w:color w:val="000000"/>
         </w:rPr>
-        <w:t> – Store multiple vampires, auto-login, update passwords, and switch characters easily.</w:t>
+        <w:t xml:space="preserve"> – Store multiple vampires, auto-login, update passwords, and switch characters easily.</w:t>
       </w:r>
     </w:p>
     <w:p>
@@ -7420,6 +7414,96 @@
           <w:color w:val="000000"/>
         </w:rPr>
         <w:t xml:space="preserve"> can do for you.</w:t>
+      </w:r>
+    </w:p>
+    <w:p>
+      <w:pPr>
+        <w:pStyle w:val="Heading1"/>
+      </w:pPr>
+      <w:r>
+        <w:t>What's New in 1.0.0</w:t>
+      </w:r>
+    </w:p>
+    <w:p>
+      <w:r>
+        <w:t>Version 1.0.0 introduces community-powered location updates while improving privacy, reliability, and location-data synchronization.</w:t>
+      </w:r>
+    </w:p>
+    <w:p>
+      <w:pPr>
+        <w:pStyle w:val="Heading2"/>
+      </w:pPr>
+      <w:r>
+        <w:t>Community Location Updates</w:t>
+      </w:r>
+    </w:p>
+    <w:p>
+      <w:pPr>
+        <w:pStyle w:val="ListParagraph"/>
+      </w:pPr>
+      <w:r>
+        <w:t>Automatic location sync: Startup and manual updates retrieve the latest guild and shop movement data.</w:t>
+      </w:r>
+    </w:p>
+    <w:p>
+      <w:pPr>
+        <w:pStyle w:val="ListParagraph"/>
+      </w:pPr>
+      <w:r>
+        <w:t>More location categories: Community-supplied banks, taverns, transit stops, places of interest, user buildings, alchemy locations, arenas, lairs, and halls can appear on the minimap and in destination lists.</w:t>
+      </w:r>
+    </w:p>
+    <w:p>
+      <w:pPr>
+        <w:pStyle w:val="ListParagraph"/>
+      </w:pPr>
+      <w:r>
+        <w:t>Opt-in reporting: When enabled, the app can anonymously report newly discovered non-moving locations so they can be shared with other players. Disable this in Settings at any time.</w:t>
+      </w:r>
+    </w:p>
+    <w:p>
+      <w:pPr>
+        <w:pStyle w:val="ListParagraph"/>
+      </w:pPr>
+      <w:r>
+        <w:t>Local data remains available: Community locations are merged into the local database and remain usable when the update service is unavailable.</w:t>
+      </w:r>
+    </w:p>
+    <w:p>
+      <w:pPr>
+        <w:pStyle w:val="Heading2"/>
+      </w:pPr>
+      <w:r>
+        <w:t>Privacy and Reliability</w:t>
+      </w:r>
+    </w:p>
+    <w:p>
+      <w:pPr>
+        <w:pStyle w:val="ListParagraph"/>
+      </w:pPr>
+      <w:r>
+        <w:t>Login cookie passwords are redacted from debug logs.</w:t>
+      </w:r>
+    </w:p>
+    <w:p>
+      <w:pPr>
+        <w:pStyle w:val="ListParagraph"/>
+      </w:pPr>
+      <w:r>
+        <w:t>Network requests use timeouts so a slow or unavailable service does not block the interface.</w:t>
+      </w:r>
+    </w:p>
+    <w:p>
+      <w:pPr>
+        <w:pStyle w:val="ListParagraph"/>
+      </w:pPr>
+      <w:r>
+        <w:t>Startup synchronization and manual updates use the same update workflow.</w:t>
+      </w:r>
+    </w:p>
+    <w:p>
+      <w:r>
+        <w:t>For bugs or feature requests, use the Report an Issue option. Include the app version, operating system, and relevant log file, but never include account passwords.</w:t>
       </w:r>
     </w:p>
     <w:p>
@@ -7443,7 +7527,7 @@
         <w:rPr>
           <w:sz w:val="1"/>
         </w:rPr>
-        <w:br w:type="textWrapping" w:clear="all"/>
+        <w:br/>
       </w:r>
       <w:r>
         <w:rPr>
@@ -7524,7 +7608,7 @@
         <w:rPr>
           <w:sz w:val="1"/>
         </w:rPr>
-        <w:br w:type="textWrapping" w:clear="all"/>
+        <w:br/>
       </w:r>
       <w:bookmarkStart w:id="5" w:name="_topic_UserInterfaceOverview"/>
       <w:bookmarkEnd w:id="5"/>
@@ -7545,7 +7629,6 @@
           <w:color w:val="4F81BD"/>
           <w:sz w:val="26"/>
         </w:rPr>
-        <w:br w:type="page"/>
       </w:r>
     </w:p>
     <w:p>
@@ -7576,7 +7659,6 @@
           <w:color w:val="4F81BD"/>
           <w:sz w:val="26"/>
         </w:rPr>
-        <w:lastRenderedPageBreak/>
         <w:t>User Interface Overview</w:t>
       </w:r>
       <w:bookmarkEnd w:id="6"/>
@@ -7637,41 +7719,6 @@
         <w:rPr>
           <w:noProof/>
         </w:rPr>
-        <w:drawing>
-          <wp:inline distT="0" distB="0" distL="0" distR="0" wp14:anchorId="08C5C379" wp14:editId="25E8B3C7">
-            <wp:extent cx="5715000" cy="6143625"/>
-            <wp:effectExtent l="0" t="0" r="0" b="0"/>
-            <wp:docPr id="1" name="Pic 1" title="Main UI Screenshot"/>
-            <wp:cNvGraphicFramePr>
-              <a:graphicFrameLocks xmlns:a="http://schemas.openxmlformats.org/drawingml/2006/main" noChangeAspect="1"/>
-            </wp:cNvGraphicFramePr>
-            <a:graphic xmlns:a="http://schemas.openxmlformats.org/drawingml/2006/main">
-              <a:graphicData uri="http://schemas.openxmlformats.org/drawingml/2006/picture">
-                <pic:pic xmlns:pic="http://schemas.openxmlformats.org/drawingml/2006/picture">
-                  <pic:nvPicPr>
-                    <pic:cNvPr id="0" name="img1.png"/>
-                    <pic:cNvPicPr/>
-                  </pic:nvPicPr>
-                  <pic:blipFill>
-                    <a:blip r:embed="rId10" cstate="print"/>
-                    <a:stretch>
-                      <a:fillRect/>
-                    </a:stretch>
-                  </pic:blipFill>
-                  <pic:spPr>
-                    <a:xfrm>
-                      <a:off x="0" y="0"/>
-                      <a:ext cx="5715000" cy="6143625"/>
-                    </a:xfrm>
-                    <a:prstGeom prst="rect">
-                      <a:avLst/>
-                    </a:prstGeom>
-                  </pic:spPr>
-                </pic:pic>
-              </a:graphicData>
-            </a:graphic>
-          </wp:inline>
-        </w:drawing>
       </w:r>
     </w:p>
     <w:p>
@@ -7735,7 +7782,7 @@
           <w:rFonts w:ascii="Times New Roman" w:eastAsia="Times New Roman" w:hAnsi="Times New Roman" w:cs="Times New Roman"/>
           <w:color w:val="000000"/>
         </w:rPr>
-        <w:t>If you're unfamiliar with the layout, start with: </w:t>
+        <w:t xml:space="preserve">If you're unfamiliar with the layout, start with: </w:t>
       </w:r>
       <w:hyperlink w:anchor="_topic_IdentifyingUIParts">
         <w:r>
@@ -7752,7 +7799,7 @@
           <w:rFonts w:ascii="Times New Roman" w:eastAsia="Times New Roman" w:hAnsi="Times New Roman" w:cs="Times New Roman"/>
           <w:color w:val="000000"/>
         </w:rPr>
-        <w:t> – This page shows a fully labeled screenshot of the application and identifies the function of each section.</w:t>
+        <w:t xml:space="preserve"> – This page shows a fully labeled screenshot of the application and identifies the function of each section.</w:t>
       </w:r>
     </w:p>
     <w:p>
@@ -7786,18 +7833,12 @@
           <w:rFonts w:ascii="Times New Roman" w:eastAsia="Times New Roman" w:hAnsi="Times New Roman" w:cs="Times New Roman"/>
           <w:color w:val="000000"/>
         </w:rPr>
-        <w:t>Learn about the </w:t>
+        <w:t xml:space="preserve">Learn about the </w:t>
       </w:r>
       <w:proofErr w:type="spellStart"/>
-      <w:r>
-        <w:fldChar w:fldCharType="begin"/>
-      </w:r>
-      <w:r>
-        <w:instrText>HYPERLINK \l "_topic_MinimapandInformationBars" \h</w:instrText>
-      </w:r>
-      <w:r>
-        <w:fldChar w:fldCharType="separate"/>
-      </w:r>
+      <w:r/>
+      <w:r/>
+      <w:r/>
       <w:r>
         <w:rPr>
           <w:rStyle w:val="Hyperlink"/>
@@ -7815,9 +7856,7 @@
         </w:rPr>
         <w:t xml:space="preserve"> and Information Bars</w:t>
       </w:r>
-      <w:r>
-        <w:fldChar w:fldCharType="end"/>
-      </w:r>
+      <w:r/>
       <w:r>
         <w:rPr>
           <w:rFonts w:ascii="Times New Roman" w:eastAsia="Times New Roman" w:hAnsi="Times New Roman" w:cs="Times New Roman"/>
@@ -7863,7 +7902,7 @@
           <w:rFonts w:ascii="Times New Roman" w:eastAsia="Times New Roman" w:hAnsi="Times New Roman" w:cs="Times New Roman"/>
           <w:color w:val="000000"/>
         </w:rPr>
-        <w:t> section to see all tools and options available in the top bar.</w:t>
+        <w:t xml:space="preserve"> section to see all tools and options available in the top bar.</w:t>
       </w:r>
     </w:p>
     <w:p>
@@ -7879,7 +7918,7 @@
           <w:rFonts w:ascii="Times New Roman" w:eastAsia="Times New Roman" w:hAnsi="Times New Roman" w:cs="Times New Roman"/>
           <w:color w:val="000000"/>
         </w:rPr>
-        <w:t>Manage vampires with the </w:t>
+        <w:t xml:space="preserve">Manage vampires with the </w:t>
       </w:r>
       <w:hyperlink w:anchor="_topic_CharacterManagement">
         <w:r>
@@ -7896,7 +7935,7 @@
           <w:rFonts w:ascii="Times New Roman" w:eastAsia="Times New Roman" w:hAnsi="Times New Roman" w:cs="Times New Roman"/>
           <w:color w:val="000000"/>
         </w:rPr>
-        <w:t> system.</w:t>
+        <w:t xml:space="preserve"> system.</w:t>
       </w:r>
     </w:p>
     <w:p>
@@ -7920,8 +7959,7 @@
         <w:rPr>
           <w:sz w:val="1"/>
         </w:rPr>
-        <w:lastRenderedPageBreak/>
-        <w:br w:type="textWrapping" w:clear="all"/>
+        <w:br/>
       </w:r>
       <w:r>
         <w:rPr>
@@ -8002,7 +8040,7 @@
         <w:rPr>
           <w:sz w:val="1"/>
         </w:rPr>
-        <w:br w:type="textWrapping" w:clear="all"/>
+        <w:br/>
       </w:r>
       <w:bookmarkStart w:id="9" w:name="_topic_IdentifyingUIParts"/>
       <w:bookmarkEnd w:id="9"/>
@@ -8023,7 +8061,6 @@
           <w:color w:val="4F81BD"/>
           <w:sz w:val="22"/>
         </w:rPr>
-        <w:br w:type="page"/>
       </w:r>
     </w:p>
     <w:p>
@@ -8054,7 +8091,6 @@
           <w:color w:val="4F81BD"/>
           <w:sz w:val="22"/>
         </w:rPr>
-        <w:lastRenderedPageBreak/>
         <w:t>Identifying UI Parts</w:t>
       </w:r>
       <w:bookmarkEnd w:id="10"/>
@@ -8115,41 +8151,6 @@
         <w:rPr>
           <w:noProof/>
         </w:rPr>
-        <w:drawing>
-          <wp:inline distT="0" distB="0" distL="0" distR="0" wp14:anchorId="6B45A352" wp14:editId="69976C4F">
-            <wp:extent cx="5991225" cy="6438900"/>
-            <wp:effectExtent l="0" t="0" r="0" b="0"/>
-            <wp:docPr id="2" name="Pic 2" title="Labeled Main UI"/>
-            <wp:cNvGraphicFramePr>
-              <a:graphicFrameLocks xmlns:a="http://schemas.openxmlformats.org/drawingml/2006/main" noChangeAspect="1"/>
-            </wp:cNvGraphicFramePr>
-            <a:graphic xmlns:a="http://schemas.openxmlformats.org/drawingml/2006/main">
-              <a:graphicData uri="http://schemas.openxmlformats.org/drawingml/2006/picture">
-                <pic:pic xmlns:pic="http://schemas.openxmlformats.org/drawingml/2006/picture">
-                  <pic:nvPicPr>
-                    <pic:cNvPr id="0" name="img2.png"/>
-                    <pic:cNvPicPr/>
-                  </pic:nvPicPr>
-                  <pic:blipFill>
-                    <a:blip r:embed="rId12" cstate="print"/>
-                    <a:stretch>
-                      <a:fillRect/>
-                    </a:stretch>
-                  </pic:blipFill>
-                  <pic:spPr>
-                    <a:xfrm>
-                      <a:off x="0" y="0"/>
-                      <a:ext cx="5991225" cy="6438900"/>
-                    </a:xfrm>
-                    <a:prstGeom prst="rect">
-                      <a:avLst/>
-                    </a:prstGeom>
-                  </pic:spPr>
-                </pic:pic>
-              </a:graphicData>
-            </a:graphic>
-          </wp:inline>
-        </w:drawing>
       </w:r>
     </w:p>
     <w:p>
@@ -8817,7 +8818,7 @@
         <w:rPr>
           <w:sz w:val="1"/>
         </w:rPr>
-        <w:br w:type="textWrapping" w:clear="all"/>
+        <w:br/>
       </w:r>
       <w:r>
         <w:rPr>
@@ -8880,7 +8881,7 @@
         <w:rPr>
           <w:sz w:val="1"/>
         </w:rPr>
-        <w:br w:type="textWrapping" w:clear="all"/>
+        <w:br/>
       </w:r>
       <w:bookmarkStart w:id="13" w:name="_topic_MenuItems"/>
       <w:bookmarkEnd w:id="13"/>
@@ -8901,7 +8902,6 @@
           <w:color w:val="4F81BD"/>
           <w:sz w:val="26"/>
         </w:rPr>
-        <w:br w:type="page"/>
       </w:r>
     </w:p>
     <w:p>
@@ -8932,7 +8932,6 @@
           <w:color w:val="4F81BD"/>
           <w:sz w:val="26"/>
         </w:rPr>
-        <w:lastRenderedPageBreak/>
         <w:t>Menu Items</w:t>
       </w:r>
       <w:bookmarkEnd w:id="14"/>
@@ -9009,41 +9008,6 @@
         <w:rPr>
           <w:noProof/>
         </w:rPr>
-        <w:drawing>
-          <wp:inline distT="0" distB="0" distL="0" distR="0" wp14:anchorId="712305B6" wp14:editId="679F1059">
-            <wp:extent cx="4762500" cy="457200"/>
-            <wp:effectExtent l="0" t="0" r="0" b="0"/>
-            <wp:docPr id="3" name="Pic 3" title="Main Menu Bar"/>
-            <wp:cNvGraphicFramePr>
-              <a:graphicFrameLocks xmlns:a="http://schemas.openxmlformats.org/drawingml/2006/main" noChangeAspect="1"/>
-            </wp:cNvGraphicFramePr>
-            <a:graphic xmlns:a="http://schemas.openxmlformats.org/drawingml/2006/main">
-              <a:graphicData uri="http://schemas.openxmlformats.org/drawingml/2006/picture">
-                <pic:pic xmlns:pic="http://schemas.openxmlformats.org/drawingml/2006/picture">
-                  <pic:nvPicPr>
-                    <pic:cNvPr id="0" name="img3.png"/>
-                    <pic:cNvPicPr/>
-                  </pic:nvPicPr>
-                  <pic:blipFill>
-                    <a:blip r:embed="rId14" cstate="print"/>
-                    <a:stretch>
-                      <a:fillRect/>
-                    </a:stretch>
-                  </pic:blipFill>
-                  <pic:spPr>
-                    <a:xfrm>
-                      <a:off x="0" y="0"/>
-                      <a:ext cx="4762500" cy="457200"/>
-                    </a:xfrm>
-                    <a:prstGeom prst="rect">
-                      <a:avLst/>
-                    </a:prstGeom>
-                  </pic:spPr>
-                </pic:pic>
-              </a:graphicData>
-            </a:graphic>
-          </wp:inline>
-        </w:drawing>
       </w:r>
     </w:p>
     <w:p>
@@ -9100,7 +9064,7 @@
           <w:rFonts w:ascii="Times New Roman" w:eastAsia="Times New Roman" w:hAnsi="Times New Roman" w:cs="Times New Roman"/>
           <w:color w:val="000000"/>
         </w:rPr>
-        <w:t> – Save screenshots or exit the application.</w:t>
+        <w:t xml:space="preserve"> – Save screenshots or exit the application.</w:t>
       </w:r>
     </w:p>
     <w:p>
@@ -9166,7 +9130,7 @@
           <w:rFonts w:ascii="Times New Roman" w:eastAsia="Times New Roman" w:hAnsi="Times New Roman" w:cs="Times New Roman"/>
           <w:color w:val="000000"/>
         </w:rPr>
-        <w:t> – Access all utility features such as log viewer, damage calculator, and database viewer.</w:t>
+        <w:t xml:space="preserve"> – Access all utility features such as log viewer, damage calculator, and database viewer.</w:t>
       </w:r>
     </w:p>
     <w:p>
@@ -9191,7 +9155,7 @@
           <w:rFonts w:ascii="Times New Roman" w:eastAsia="Times New Roman" w:hAnsi="Times New Roman" w:cs="Times New Roman"/>
           <w:color w:val="000000"/>
         </w:rPr>
-        <w:t> – Quickly open relevant guides, maps, and community tools.</w:t>
+        <w:t xml:space="preserve"> – Quickly open relevant guides, maps, and community tools.</w:t>
       </w:r>
     </w:p>
     <w:p>
@@ -9217,7 +9181,7 @@
           <w:rFonts w:ascii="Times New Roman" w:eastAsia="Times New Roman" w:hAnsi="Times New Roman" w:cs="Times New Roman"/>
           <w:color w:val="000000"/>
         </w:rPr>
-        <w:t> – View help, credits, FAQ, or report bugs.</w:t>
+        <w:t xml:space="preserve"> – View help, credits, FAQ, or report bugs.</w:t>
       </w:r>
     </w:p>
     <w:p>
@@ -9257,7 +9221,7 @@
         <w:rPr>
           <w:sz w:val="1"/>
         </w:rPr>
-        <w:br w:type="textWrapping" w:clear="all"/>
+        <w:br/>
       </w:r>
       <w:r>
         <w:rPr>
@@ -9330,7 +9294,7 @@
         <w:rPr>
           <w:sz w:val="1"/>
         </w:rPr>
-        <w:br w:type="textWrapping" w:clear="all"/>
+        <w:br/>
       </w:r>
       <w:bookmarkStart w:id="16" w:name="_topic_FileMenu"/>
       <w:bookmarkStart w:id="17" w:name="_Toc197162300"/>
@@ -9378,7 +9342,7 @@
           <w:rFonts w:ascii="Times New Roman" w:eastAsia="Times New Roman" w:hAnsi="Times New Roman" w:cs="Times New Roman"/>
           <w:color w:val="000000"/>
         </w:rPr>
-        <w:t>The </w:t>
+        <w:t xml:space="preserve">The </w:t>
       </w:r>
       <w:r>
         <w:rPr>
@@ -9417,41 +9381,6 @@
         <w:rPr>
           <w:noProof/>
         </w:rPr>
-        <w:drawing>
-          <wp:inline distT="0" distB="0" distL="0" distR="0" wp14:anchorId="5C4322A3" wp14:editId="1694AE2B">
-            <wp:extent cx="2857500" cy="1609725"/>
-            <wp:effectExtent l="0" t="0" r="0" b="0"/>
-            <wp:docPr id="4" name="Pic 4" title="File Menu Options"/>
-            <wp:cNvGraphicFramePr>
-              <a:graphicFrameLocks xmlns:a="http://schemas.openxmlformats.org/drawingml/2006/main" noChangeAspect="1"/>
-            </wp:cNvGraphicFramePr>
-            <a:graphic xmlns:a="http://schemas.openxmlformats.org/drawingml/2006/main">
-              <a:graphicData uri="http://schemas.openxmlformats.org/drawingml/2006/picture">
-                <pic:pic xmlns:pic="http://schemas.openxmlformats.org/drawingml/2006/picture">
-                  <pic:nvPicPr>
-                    <pic:cNvPr id="0" name="img4.png"/>
-                    <pic:cNvPicPr/>
-                  </pic:nvPicPr>
-                  <pic:blipFill>
-                    <a:blip r:embed="rId16" cstate="print"/>
-                    <a:stretch>
-                      <a:fillRect/>
-                    </a:stretch>
-                  </pic:blipFill>
-                  <pic:spPr>
-                    <a:xfrm>
-                      <a:off x="0" y="0"/>
-                      <a:ext cx="2857500" cy="1609725"/>
-                    </a:xfrm>
-                    <a:prstGeom prst="rect">
-                      <a:avLst/>
-                    </a:prstGeom>
-                  </pic:spPr>
-                </pic:pic>
-              </a:graphicData>
-            </a:graphic>
-          </wp:inline>
-        </w:drawing>
       </w:r>
     </w:p>
     <w:p>
@@ -9604,7 +9533,7 @@
           <w:rFonts w:ascii="Times New Roman" w:eastAsia="Times New Roman" w:hAnsi="Times New Roman" w:cs="Times New Roman"/>
           <w:color w:val="000000"/>
         </w:rPr>
-        <w:t> Closes the application immediately.</w:t>
+        <w:t xml:space="preserve"> Closes the application immediately.</w:t>
       </w:r>
     </w:p>
     <w:p>
@@ -9644,7 +9573,7 @@
         <w:rPr>
           <w:sz w:val="1"/>
         </w:rPr>
-        <w:br w:type="textWrapping" w:clear="all"/>
+        <w:br/>
       </w:r>
       <w:r>
         <w:rPr>
@@ -9707,7 +9636,7 @@
         <w:rPr>
           <w:sz w:val="1"/>
         </w:rPr>
-        <w:br w:type="textWrapping" w:clear="all"/>
+        <w:br/>
       </w:r>
       <w:bookmarkStart w:id="20" w:name="_topic_SettingsMenu"/>
       <w:bookmarkEnd w:id="20"/>
@@ -9728,7 +9657,6 @@
           <w:color w:val="4F81BD"/>
           <w:sz w:val="22"/>
         </w:rPr>
-        <w:br w:type="page"/>
       </w:r>
     </w:p>
     <w:p>
@@ -9759,7 +9687,6 @@
           <w:color w:val="4F81BD"/>
           <w:sz w:val="22"/>
         </w:rPr>
-        <w:lastRenderedPageBreak/>
         <w:t>Settings Menu</w:t>
       </w:r>
       <w:bookmarkEnd w:id="21"/>
@@ -9796,7 +9723,7 @@
           <w:rFonts w:ascii="Times New Roman" w:eastAsia="Times New Roman" w:hAnsi="Times New Roman" w:cs="Times New Roman"/>
           <w:color w:val="000000"/>
         </w:rPr>
-        <w:t>The </w:t>
+        <w:t xml:space="preserve">The </w:t>
       </w:r>
       <w:r>
         <w:rPr>
@@ -9835,41 +9762,6 @@
         <w:rPr>
           <w:noProof/>
         </w:rPr>
-        <w:drawing>
-          <wp:inline distT="0" distB="0" distL="0" distR="0" wp14:anchorId="60EA7120" wp14:editId="1D02B9BC">
-            <wp:extent cx="2381250" cy="2581275"/>
-            <wp:effectExtent l="0" t="0" r="0" b="0"/>
-            <wp:docPr id="5" name="Pic 5" title="Settings menu dropdown"/>
-            <wp:cNvGraphicFramePr>
-              <a:graphicFrameLocks xmlns:a="http://schemas.openxmlformats.org/drawingml/2006/main" noChangeAspect="1"/>
-            </wp:cNvGraphicFramePr>
-            <a:graphic xmlns:a="http://schemas.openxmlformats.org/drawingml/2006/main">
-              <a:graphicData uri="http://schemas.openxmlformats.org/drawingml/2006/picture">
-                <pic:pic xmlns:pic="http://schemas.openxmlformats.org/drawingml/2006/picture">
-                  <pic:nvPicPr>
-                    <pic:cNvPr id="0" name="img5.png"/>
-                    <pic:cNvPicPr/>
-                  </pic:nvPicPr>
-                  <pic:blipFill>
-                    <a:blip r:embed="rId18" cstate="print"/>
-                    <a:stretch>
-                      <a:fillRect/>
-                    </a:stretch>
-                  </pic:blipFill>
-                  <pic:spPr>
-                    <a:xfrm>
-                      <a:off x="0" y="0"/>
-                      <a:ext cx="2381250" cy="2581275"/>
-                    </a:xfrm>
-                    <a:prstGeom prst="rect">
-                      <a:avLst/>
-                    </a:prstGeom>
-                  </pic:spPr>
-                </pic:pic>
-              </a:graphicData>
-            </a:graphic>
-          </wp:inline>
-        </w:drawing>
       </w:r>
     </w:p>
     <w:p>
@@ -9911,7 +9803,7 @@
           <w:rFonts w:ascii="Times New Roman" w:eastAsia="Times New Roman" w:hAnsi="Times New Roman" w:cs="Times New Roman"/>
           <w:color w:val="000000"/>
         </w:rPr>
-        <w:t> Opens the </w:t>
+        <w:t xml:space="preserve"> Opens the </w:t>
       </w:r>
       <w:hyperlink w:anchor="_topic_ThemeCustomizationDialog">
         <w:r>
@@ -9967,7 +9859,7 @@
           <w:rFonts w:ascii="Times New Roman" w:eastAsia="Times New Roman" w:hAnsi="Times New Roman" w:cs="Times New Roman"/>
           <w:color w:val="000000"/>
         </w:rPr>
-        <w:t> Opens the </w:t>
+        <w:t xml:space="preserve"> Opens the </w:t>
       </w:r>
       <w:hyperlink w:anchor="_topic_CSSCustomization">
         <w:r>
@@ -10072,7 +9964,7 @@
           <w:rFonts w:ascii="Times New Roman" w:eastAsia="Times New Roman" w:hAnsi="Times New Roman" w:cs="Times New Roman"/>
           <w:color w:val="000000"/>
         </w:rPr>
-        <w:t> Select how movement keys behave:</w:t>
+        <w:t xml:space="preserve"> Select how movement keys behave:</w:t>
       </w:r>
     </w:p>
     <w:p>
@@ -10095,7 +9987,7 @@
           <w:rFonts w:ascii="Times New Roman" w:eastAsia="Times New Roman" w:hAnsi="Times New Roman" w:cs="Times New Roman"/>
           <w:color w:val="000000"/>
         </w:rPr>
-        <w:t> Default movement keys (W = North, A = West, etc.)</w:t>
+        <w:t xml:space="preserve"> Default movement keys (W = North, A = West, etc.)</w:t>
       </w:r>
     </w:p>
     <w:p>
@@ -10118,7 +10010,7 @@
           <w:rFonts w:ascii="Times New Roman" w:eastAsia="Times New Roman" w:hAnsi="Times New Roman" w:cs="Times New Roman"/>
           <w:color w:val="000000"/>
         </w:rPr>
-        <w:t> Uses the keyboard arrow keys for movement.</w:t>
+        <w:t xml:space="preserve"> Uses the keyboard arrow keys for movement.</w:t>
       </w:r>
     </w:p>
     <w:p>
@@ -10141,7 +10033,7 @@
           <w:rFonts w:ascii="Times New Roman" w:eastAsia="Times New Roman" w:hAnsi="Times New Roman" w:cs="Times New Roman"/>
           <w:color w:val="000000"/>
         </w:rPr>
-        <w:t> Disables keyboard movement entirely.</w:t>
+        <w:t xml:space="preserve"> Disables keyboard movement entirely.</w:t>
       </w:r>
     </w:p>
     <w:p>
@@ -10152,41 +10044,6 @@
         <w:rPr>
           <w:noProof/>
         </w:rPr>
-        <w:drawing>
-          <wp:inline distT="0" distB="0" distL="0" distR="0" wp14:anchorId="0C9C245C" wp14:editId="5D2BA6B3">
-            <wp:extent cx="2381250" cy="1914525"/>
-            <wp:effectExtent l="0" t="0" r="0" b="0"/>
-            <wp:docPr id="6" name="Pic 6" title="Keybindings submenu"/>
-            <wp:cNvGraphicFramePr>
-              <a:graphicFrameLocks xmlns:a="http://schemas.openxmlformats.org/drawingml/2006/main" noChangeAspect="1"/>
-            </wp:cNvGraphicFramePr>
-            <a:graphic xmlns:a="http://schemas.openxmlformats.org/drawingml/2006/main">
-              <a:graphicData uri="http://schemas.openxmlformats.org/drawingml/2006/picture">
-                <pic:pic xmlns:pic="http://schemas.openxmlformats.org/drawingml/2006/picture">
-                  <pic:nvPicPr>
-                    <pic:cNvPr id="0" name="img6.png"/>
-                    <pic:cNvPicPr/>
-                  </pic:nvPicPr>
-                  <pic:blipFill>
-                    <a:blip r:embed="rId19" cstate="print"/>
-                    <a:stretch>
-                      <a:fillRect/>
-                    </a:stretch>
-                  </pic:blipFill>
-                  <pic:spPr>
-                    <a:xfrm>
-                      <a:off x="0" y="0"/>
-                      <a:ext cx="2381250" cy="1914525"/>
-                    </a:xfrm>
-                    <a:prstGeom prst="rect">
-                      <a:avLst/>
-                    </a:prstGeom>
-                  </pic:spPr>
-                </pic:pic>
-              </a:graphicData>
-            </a:graphic>
-          </wp:inline>
-        </w:drawing>
       </w:r>
     </w:p>
     <w:p>
@@ -10209,7 +10066,7 @@
           <w:rFonts w:ascii="Times New Roman" w:eastAsia="Times New Roman" w:hAnsi="Times New Roman" w:cs="Times New Roman"/>
           <w:color w:val="000000"/>
         </w:rPr>
-        <w:t> Sets the minimum log severity displayed in the Log Viewer:</w:t>
+        <w:t xml:space="preserve"> Sets the minimum log severity displayed in the Log Viewer:</w:t>
       </w:r>
     </w:p>
     <w:p>
@@ -10232,7 +10089,7 @@
           <w:rFonts w:ascii="Times New Roman" w:eastAsia="Times New Roman" w:hAnsi="Times New Roman" w:cs="Times New Roman"/>
           <w:color w:val="000000"/>
         </w:rPr>
-        <w:t> Show everything including verbose messages. This is the default setting.</w:t>
+        <w:t xml:space="preserve"> Show everything including verbose messages. This is the default setting.</w:t>
       </w:r>
     </w:p>
     <w:p>
@@ -10255,7 +10112,7 @@
           <w:rFonts w:ascii="Times New Roman" w:eastAsia="Times New Roman" w:hAnsi="Times New Roman" w:cs="Times New Roman"/>
           <w:color w:val="000000"/>
         </w:rPr>
-        <w:t> General activity reports.</w:t>
+        <w:t xml:space="preserve"> General activity reports.</w:t>
       </w:r>
     </w:p>
     <w:p>
@@ -10278,7 +10135,7 @@
           <w:rFonts w:ascii="Times New Roman" w:eastAsia="Times New Roman" w:hAnsi="Times New Roman" w:cs="Times New Roman"/>
           <w:color w:val="000000"/>
         </w:rPr>
-        <w:t> Non-breaking issues.</w:t>
+        <w:t xml:space="preserve"> Non-breaking issues.</w:t>
       </w:r>
     </w:p>
     <w:p>
@@ -10301,7 +10158,7 @@
           <w:rFonts w:ascii="Times New Roman" w:eastAsia="Times New Roman" w:hAnsi="Times New Roman" w:cs="Times New Roman"/>
           <w:color w:val="000000"/>
         </w:rPr>
-        <w:t> Problems that prevent features from working.</w:t>
+        <w:t xml:space="preserve"> Problems that prevent features from working.</w:t>
       </w:r>
     </w:p>
     <w:p>
@@ -10317,7 +10174,6 @@
           <w:rFonts w:ascii="Times New Roman" w:eastAsia="Times New Roman" w:hAnsi="Times New Roman" w:cs="Times New Roman"/>
           <w:color w:val="000000"/>
         </w:rPr>
-        <w:lastRenderedPageBreak/>
         <w:t>CRITICAL:</w:t>
       </w:r>
       <w:r>
@@ -10325,7 +10181,7 @@
           <w:rFonts w:ascii="Times New Roman" w:eastAsia="Times New Roman" w:hAnsi="Times New Roman" w:cs="Times New Roman"/>
           <w:color w:val="000000"/>
         </w:rPr>
-        <w:t> Severe issues affecting stability.</w:t>
+        <w:t xml:space="preserve"> Severe issues affecting stability.</w:t>
       </w:r>
     </w:p>
     <w:p>
@@ -10348,7 +10204,7 @@
           <w:rFonts w:ascii="Times New Roman" w:eastAsia="Times New Roman" w:hAnsi="Times New Roman" w:cs="Times New Roman"/>
           <w:color w:val="000000"/>
         </w:rPr>
-        <w:t> Disables log output completely.</w:t>
+        <w:t xml:space="preserve"> Disables log output completely.</w:t>
       </w:r>
     </w:p>
     <w:p>
@@ -10360,41 +10216,6 @@
         <w:rPr>
           <w:noProof/>
         </w:rPr>
-        <w:drawing>
-          <wp:inline distT="0" distB="0" distL="0" distR="0" wp14:anchorId="6EA71397" wp14:editId="1AA77DA5">
-            <wp:extent cx="2857500" cy="3219450"/>
-            <wp:effectExtent l="0" t="0" r="0" b="0"/>
-            <wp:docPr id="7" name="Pic 7" title="Logging level submenu"/>
-            <wp:cNvGraphicFramePr>
-              <a:graphicFrameLocks xmlns:a="http://schemas.openxmlformats.org/drawingml/2006/main" noChangeAspect="1"/>
-            </wp:cNvGraphicFramePr>
-            <a:graphic xmlns:a="http://schemas.openxmlformats.org/drawingml/2006/main">
-              <a:graphicData uri="http://schemas.openxmlformats.org/drawingml/2006/picture">
-                <pic:pic xmlns:pic="http://schemas.openxmlformats.org/drawingml/2006/picture">
-                  <pic:nvPicPr>
-                    <pic:cNvPr id="0" name="img7.png"/>
-                    <pic:cNvPicPr/>
-                  </pic:nvPicPr>
-                  <pic:blipFill>
-                    <a:blip r:embed="rId20" cstate="print"/>
-                    <a:stretch>
-                      <a:fillRect/>
-                    </a:stretch>
-                  </pic:blipFill>
-                  <pic:spPr>
-                    <a:xfrm>
-                      <a:off x="0" y="0"/>
-                      <a:ext cx="2857500" cy="3219450"/>
-                    </a:xfrm>
-                    <a:prstGeom prst="rect">
-                      <a:avLst/>
-                    </a:prstGeom>
-                  </pic:spPr>
-                </pic:pic>
-              </a:graphicData>
-            </a:graphic>
-          </wp:inline>
-        </w:drawing>
       </w:r>
     </w:p>
     <w:p>
@@ -10434,7 +10255,7 @@
         <w:rPr>
           <w:sz w:val="1"/>
         </w:rPr>
-        <w:br w:type="textWrapping" w:clear="all"/>
+        <w:br/>
       </w:r>
       <w:r>
         <w:rPr>
@@ -10496,7 +10317,7 @@
         <w:rPr>
           <w:sz w:val="1"/>
         </w:rPr>
-        <w:br w:type="textWrapping" w:clear="all"/>
+        <w:br/>
       </w:r>
       <w:bookmarkStart w:id="24" w:name="_topic_ThemeCustomizationDialog"/>
       <w:bookmarkEnd w:id="24"/>
@@ -10515,7 +10336,6 @@
           <w:color w:val="4F81BD"/>
           <w:sz w:val="22"/>
         </w:rPr>
-        <w:br w:type="page"/>
       </w:r>
     </w:p>
     <w:p>
@@ -10543,7 +10363,6 @@
           <w:color w:val="4F81BD"/>
           <w:sz w:val="22"/>
         </w:rPr>
-        <w:lastRenderedPageBreak/>
         <w:t>Theme Customization Dialog</w:t>
       </w:r>
     </w:p>
@@ -10619,41 +10438,6 @@
         <w:rPr>
           <w:noProof/>
         </w:rPr>
-        <w:drawing>
-          <wp:inline distT="0" distB="0" distL="0" distR="0" wp14:anchorId="268BEB19" wp14:editId="60C6F4D9">
-            <wp:extent cx="4286250" cy="3581400"/>
-            <wp:effectExtent l="0" t="0" r="0" b="0"/>
-            <wp:docPr id="8" name="Pic 8" title="UI Theme Customization"/>
-            <wp:cNvGraphicFramePr>
-              <a:graphicFrameLocks xmlns:a="http://schemas.openxmlformats.org/drawingml/2006/main" noChangeAspect="1"/>
-            </wp:cNvGraphicFramePr>
-            <a:graphic xmlns:a="http://schemas.openxmlformats.org/drawingml/2006/main">
-              <a:graphicData uri="http://schemas.openxmlformats.org/drawingml/2006/picture">
-                <pic:pic xmlns:pic="http://schemas.openxmlformats.org/drawingml/2006/picture">
-                  <pic:nvPicPr>
-                    <pic:cNvPr id="0" name="img8.png"/>
-                    <pic:cNvPicPr/>
-                  </pic:nvPicPr>
-                  <pic:blipFill>
-                    <a:blip r:embed="rId22" cstate="print"/>
-                    <a:stretch>
-                      <a:fillRect/>
-                    </a:stretch>
-                  </pic:blipFill>
-                  <pic:spPr>
-                    <a:xfrm>
-                      <a:off x="0" y="0"/>
-                      <a:ext cx="4286250" cy="3581400"/>
-                    </a:xfrm>
-                    <a:prstGeom prst="rect">
-                      <a:avLst/>
-                    </a:prstGeom>
-                  </pic:spPr>
-                </pic:pic>
-              </a:graphicData>
-            </a:graphic>
-          </wp:inline>
-        </w:drawing>
       </w:r>
     </w:p>
     <w:p>
@@ -10705,7 +10489,7 @@
           <w:rFonts w:ascii="Times New Roman" w:eastAsia="Times New Roman" w:hAnsi="Times New Roman" w:cs="Times New Roman"/>
           <w:color w:val="000000"/>
         </w:rPr>
-        <w:t> Customize tile highlights for Banks, Taverns, Transit Points, Destinations, and more.</w:t>
+        <w:t xml:space="preserve"> Customize tile highlights for Banks, Taverns, Transit Points, Destinations, and more.</w:t>
       </w:r>
     </w:p>
     <w:p>
@@ -10728,7 +10512,7 @@
           <w:rFonts w:ascii="Times New Roman" w:eastAsia="Times New Roman" w:hAnsi="Times New Roman" w:cs="Times New Roman"/>
           <w:color w:val="000000"/>
         </w:rPr>
-        <w:t> Adjust the line color and width for direct and transit-based movement routes.</w:t>
+        <w:t xml:space="preserve"> Adjust the line color and width for direct and transit-based movement routes.</w:t>
       </w:r>
     </w:p>
     <w:p>
@@ -10762,7 +10546,7 @@
           <w:rFonts w:ascii="Times New Roman" w:eastAsia="Times New Roman" w:hAnsi="Times New Roman" w:cs="Times New Roman"/>
           <w:color w:val="000000"/>
         </w:rPr>
-        <w:t> Applies your color choices live to preview contrast and readability.</w:t>
+        <w:t xml:space="preserve"> Applies your color choices live to preview contrast and readability.</w:t>
       </w:r>
     </w:p>
     <w:p>
@@ -10770,42 +10554,6 @@
         <w:rPr>
           <w:noProof/>
         </w:rPr>
-        <w:lastRenderedPageBreak/>
-        <w:drawing>
-          <wp:inline distT="0" distB="0" distL="0" distR="0" wp14:anchorId="4BAC0FB5" wp14:editId="22E37BA8">
-            <wp:extent cx="4286250" cy="3581400"/>
-            <wp:effectExtent l="0" t="0" r="0" b="0"/>
-            <wp:docPr id="9" name="Pic 9" title="Minimap Theme Customization"/>
-            <wp:cNvGraphicFramePr>
-              <a:graphicFrameLocks xmlns:a="http://schemas.openxmlformats.org/drawingml/2006/main" noChangeAspect="1"/>
-            </wp:cNvGraphicFramePr>
-            <a:graphic xmlns:a="http://schemas.openxmlformats.org/drawingml/2006/main">
-              <a:graphicData uri="http://schemas.openxmlformats.org/drawingml/2006/picture">
-                <pic:pic xmlns:pic="http://schemas.openxmlformats.org/drawingml/2006/picture">
-                  <pic:nvPicPr>
-                    <pic:cNvPr id="0" name="img9.png"/>
-                    <pic:cNvPicPr/>
-                  </pic:nvPicPr>
-                  <pic:blipFill>
-                    <a:blip r:embed="rId23" cstate="print"/>
-                    <a:stretch>
-                      <a:fillRect/>
-                    </a:stretch>
-                  </pic:blipFill>
-                  <pic:spPr>
-                    <a:xfrm>
-                      <a:off x="0" y="0"/>
-                      <a:ext cx="4286250" cy="3581400"/>
-                    </a:xfrm>
-                    <a:prstGeom prst="rect">
-                      <a:avLst/>
-                    </a:prstGeom>
-                  </pic:spPr>
-                </pic:pic>
-              </a:graphicData>
-            </a:graphic>
-          </wp:inline>
-        </w:drawing>
       </w:r>
     </w:p>
     <w:p>
@@ -10856,7 +10604,7 @@
           <w:rFonts w:ascii="Times New Roman" w:eastAsia="Times New Roman" w:hAnsi="Times New Roman" w:cs="Times New Roman"/>
           <w:color w:val="000000"/>
         </w:rPr>
-        <w:t> Toggle automatic text resizing at different zoom levels.</w:t>
+        <w:t xml:space="preserve"> Toggle automatic text resizing at different zoom levels.</w:t>
       </w:r>
     </w:p>
     <w:p>
@@ -10879,7 +10627,7 @@
           <w:rFonts w:ascii="Times New Roman" w:eastAsia="Times New Roman" w:hAnsi="Times New Roman" w:cs="Times New Roman"/>
           <w:color w:val="000000"/>
         </w:rPr>
-        <w:t> Enable or disable transit icons and secondary highlights.</w:t>
+        <w:t xml:space="preserve"> Enable or disable transit icons and secondary highlights.</w:t>
       </w:r>
     </w:p>
     <w:p>
@@ -10903,7 +10651,7 @@
           <w:rFonts w:ascii="Times New Roman" w:eastAsia="Times New Roman" w:hAnsi="Times New Roman" w:cs="Times New Roman"/>
           <w:color w:val="000000"/>
         </w:rPr>
-        <w:t> Customize edge colors and grid visibility.</w:t>
+        <w:t xml:space="preserve"> Customize edge colors and grid visibility.</w:t>
       </w:r>
     </w:p>
     <w:p>
@@ -10959,7 +10707,7 @@
         <w:rPr>
           <w:sz w:val="1"/>
         </w:rPr>
-        <w:br w:type="textWrapping" w:clear="all"/>
+        <w:br/>
       </w:r>
       <w:r>
         <w:rPr>
@@ -11021,7 +10769,7 @@
         <w:rPr>
           <w:sz w:val="1"/>
         </w:rPr>
-        <w:br w:type="textWrapping" w:clear="all"/>
+        <w:br/>
       </w:r>
       <w:bookmarkStart w:id="28" w:name="_topic_CSSCustomization"/>
       <w:bookmarkEnd w:id="28"/>
@@ -11040,7 +10788,6 @@
           <w:color w:val="4F81BD"/>
           <w:sz w:val="22"/>
         </w:rPr>
-        <w:br w:type="page"/>
       </w:r>
     </w:p>
     <w:p>
@@ -11068,7 +10815,6 @@
           <w:color w:val="4F81BD"/>
           <w:sz w:val="22"/>
         </w:rPr>
-        <w:lastRenderedPageBreak/>
         <w:t>CSS Customization</w:t>
       </w:r>
     </w:p>
@@ -11144,41 +10890,6 @@
         <w:rPr>
           <w:noProof/>
         </w:rPr>
-        <w:drawing>
-          <wp:inline distT="0" distB="0" distL="0" distR="0" wp14:anchorId="0C0B9AE6" wp14:editId="34422C3E">
-            <wp:extent cx="4286250" cy="3067050"/>
-            <wp:effectExtent l="0" t="0" r="0" b="0"/>
-            <wp:docPr id="10" name="Pic 10" title="CSS Profile List"/>
-            <wp:cNvGraphicFramePr>
-              <a:graphicFrameLocks xmlns:a="http://schemas.openxmlformats.org/drawingml/2006/main" noChangeAspect="1"/>
-            </wp:cNvGraphicFramePr>
-            <a:graphic xmlns:a="http://schemas.openxmlformats.org/drawingml/2006/main">
-              <a:graphicData uri="http://schemas.openxmlformats.org/drawingml/2006/picture">
-                <pic:pic xmlns:pic="http://schemas.openxmlformats.org/drawingml/2006/picture">
-                  <pic:nvPicPr>
-                    <pic:cNvPr id="0" name="img10.png"/>
-                    <pic:cNvPicPr/>
-                  </pic:nvPicPr>
-                  <pic:blipFill>
-                    <a:blip r:embed="rId25" cstate="print"/>
-                    <a:stretch>
-                      <a:fillRect/>
-                    </a:stretch>
-                  </pic:blipFill>
-                  <pic:spPr>
-                    <a:xfrm>
-                      <a:off x="0" y="0"/>
-                      <a:ext cx="4286250" cy="3067050"/>
-                    </a:xfrm>
-                    <a:prstGeom prst="rect">
-                      <a:avLst/>
-                    </a:prstGeom>
-                  </pic:spPr>
-                </pic:pic>
-              </a:graphicData>
-            </a:graphic>
-          </wp:inline>
-        </w:drawing>
       </w:r>
     </w:p>
     <w:p>
@@ -11278,7 +10989,7 @@
           <w:rFonts w:ascii="Times New Roman" w:eastAsia="Times New Roman" w:hAnsi="Times New Roman" w:cs="Times New Roman"/>
           <w:color w:val="000000"/>
         </w:rPr>
-        <w:t>You can import a pre-written CSS file using the </w:t>
+        <w:t xml:space="preserve">You can import a pre-written CSS file using the </w:t>
       </w:r>
       <w:r>
         <w:rPr>
@@ -11293,7 +11004,7 @@
           <w:rFonts w:ascii="Times New Roman" w:eastAsia="Times New Roman" w:hAnsi="Times New Roman" w:cs="Times New Roman"/>
           <w:color w:val="000000"/>
         </w:rPr>
-        <w:t> button:</w:t>
+        <w:t xml:space="preserve"> button:</w:t>
       </w:r>
     </w:p>
     <w:p>
@@ -11308,7 +11019,7 @@
           <w:rFonts w:ascii="Times New Roman" w:eastAsia="Times New Roman" w:hAnsi="Times New Roman" w:cs="Times New Roman"/>
           <w:color w:val="000000"/>
         </w:rPr>
-        <w:t>Click </w:t>
+        <w:t xml:space="preserve">Click </w:t>
       </w:r>
       <w:r>
         <w:rPr>
@@ -11323,7 +11034,7 @@
           <w:rFonts w:ascii="Times New Roman" w:eastAsia="Times New Roman" w:hAnsi="Times New Roman" w:cs="Times New Roman"/>
           <w:color w:val="000000"/>
         </w:rPr>
-        <w:t> to browse for a </w:t>
+        <w:t xml:space="preserve"> to browse for a </w:t>
       </w:r>
       <w:r>
         <w:rPr>
@@ -11346,7 +11057,7 @@
           <w:rFonts w:ascii="Times New Roman" w:eastAsia="Times New Roman" w:hAnsi="Times New Roman" w:cs="Times New Roman"/>
           <w:color w:val="000000"/>
         </w:rPr>
-        <w:t> file on your system.</w:t>
+        <w:t xml:space="preserve"> file on your system.</w:t>
       </w:r>
     </w:p>
     <w:p>
@@ -11385,42 +11096,6 @@
         <w:rPr>
           <w:noProof/>
         </w:rPr>
-        <w:lastRenderedPageBreak/>
-        <w:drawing>
-          <wp:inline distT="0" distB="0" distL="0" distR="0" wp14:anchorId="69A81353" wp14:editId="6FFA37F5">
-            <wp:extent cx="4286250" cy="3067050"/>
-            <wp:effectExtent l="0" t="0" r="0" b="0"/>
-            <wp:docPr id="11" name="Pic 11" title="Color Picker"/>
-            <wp:cNvGraphicFramePr>
-              <a:graphicFrameLocks xmlns:a="http://schemas.openxmlformats.org/drawingml/2006/main" noChangeAspect="1"/>
-            </wp:cNvGraphicFramePr>
-            <a:graphic xmlns:a="http://schemas.openxmlformats.org/drawingml/2006/main">
-              <a:graphicData uri="http://schemas.openxmlformats.org/drawingml/2006/picture">
-                <pic:pic xmlns:pic="http://schemas.openxmlformats.org/drawingml/2006/picture">
-                  <pic:nvPicPr>
-                    <pic:cNvPr id="0" name="img11.png"/>
-                    <pic:cNvPicPr/>
-                  </pic:nvPicPr>
-                  <pic:blipFill>
-                    <a:blip r:embed="rId26" cstate="print"/>
-                    <a:stretch>
-                      <a:fillRect/>
-                    </a:stretch>
-                  </pic:blipFill>
-                  <pic:spPr>
-                    <a:xfrm>
-                      <a:off x="0" y="0"/>
-                      <a:ext cx="4286250" cy="3067050"/>
-                    </a:xfrm>
-                    <a:prstGeom prst="rect">
-                      <a:avLst/>
-                    </a:prstGeom>
-                  </pic:spPr>
-                </pic:pic>
-              </a:graphicData>
-            </a:graphic>
-          </wp:inline>
-        </w:drawing>
       </w:r>
     </w:p>
     <w:p>
@@ -11478,41 +11153,6 @@
         <w:rPr>
           <w:noProof/>
         </w:rPr>
-        <w:drawing>
-          <wp:inline distT="0" distB="0" distL="0" distR="0" wp14:anchorId="6D41A5EA" wp14:editId="0A870237">
-            <wp:extent cx="4286250" cy="3067050"/>
-            <wp:effectExtent l="0" t="0" r="0" b="0"/>
-            <wp:docPr id="12" name="Pic 12" title="Background Image Selection"/>
-            <wp:cNvGraphicFramePr>
-              <a:graphicFrameLocks xmlns:a="http://schemas.openxmlformats.org/drawingml/2006/main" noChangeAspect="1"/>
-            </wp:cNvGraphicFramePr>
-            <a:graphic xmlns:a="http://schemas.openxmlformats.org/drawingml/2006/main">
-              <a:graphicData uri="http://schemas.openxmlformats.org/drawingml/2006/picture">
-                <pic:pic xmlns:pic="http://schemas.openxmlformats.org/drawingml/2006/picture">
-                  <pic:nvPicPr>
-                    <pic:cNvPr id="0" name="img12.png"/>
-                    <pic:cNvPicPr/>
-                  </pic:nvPicPr>
-                  <pic:blipFill>
-                    <a:blip r:embed="rId27" cstate="print"/>
-                    <a:stretch>
-                      <a:fillRect/>
-                    </a:stretch>
-                  </pic:blipFill>
-                  <pic:spPr>
-                    <a:xfrm>
-                      <a:off x="0" y="0"/>
-                      <a:ext cx="4286250" cy="3067050"/>
-                    </a:xfrm>
-                    <a:prstGeom prst="rect">
-                      <a:avLst/>
-                    </a:prstGeom>
-                  </pic:spPr>
-                </pic:pic>
-              </a:graphicData>
-            </a:graphic>
-          </wp:inline>
-        </w:drawing>
       </w:r>
     </w:p>
     <w:p>
@@ -11570,42 +11210,6 @@
         <w:rPr>
           <w:noProof/>
         </w:rPr>
-        <w:lastRenderedPageBreak/>
-        <w:drawing>
-          <wp:inline distT="0" distB="0" distL="0" distR="0" wp14:anchorId="786CA35C" wp14:editId="7AC40724">
-            <wp:extent cx="4286250" cy="3067050"/>
-            <wp:effectExtent l="0" t="0" r="0" b="0"/>
-            <wp:docPr id="13" name="Pic 13" title="Shadow and Advanced Effects"/>
-            <wp:cNvGraphicFramePr>
-              <a:graphicFrameLocks xmlns:a="http://schemas.openxmlformats.org/drawingml/2006/main" noChangeAspect="1"/>
-            </wp:cNvGraphicFramePr>
-            <a:graphic xmlns:a="http://schemas.openxmlformats.org/drawingml/2006/main">
-              <a:graphicData uri="http://schemas.openxmlformats.org/drawingml/2006/picture">
-                <pic:pic xmlns:pic="http://schemas.openxmlformats.org/drawingml/2006/picture">
-                  <pic:nvPicPr>
-                    <pic:cNvPr id="0" name="img13.png"/>
-                    <pic:cNvPicPr/>
-                  </pic:nvPicPr>
-                  <pic:blipFill>
-                    <a:blip r:embed="rId28" cstate="print"/>
-                    <a:stretch>
-                      <a:fillRect/>
-                    </a:stretch>
-                  </pic:blipFill>
-                  <pic:spPr>
-                    <a:xfrm>
-                      <a:off x="0" y="0"/>
-                      <a:ext cx="4286250" cy="3067050"/>
-                    </a:xfrm>
-                    <a:prstGeom prst="rect">
-                      <a:avLst/>
-                    </a:prstGeom>
-                  </pic:spPr>
-                </pic:pic>
-              </a:graphicData>
-            </a:graphic>
-          </wp:inline>
-        </w:drawing>
       </w:r>
     </w:p>
     <w:p>
@@ -11695,7 +11299,7 @@
         <w:rPr>
           <w:sz w:val="1"/>
         </w:rPr>
-        <w:br w:type="textWrapping" w:clear="all"/>
+        <w:br/>
       </w:r>
       <w:r>
         <w:rPr>
@@ -11794,7 +11398,7 @@
         <w:rPr>
           <w:sz w:val="1"/>
         </w:rPr>
-        <w:br w:type="textWrapping" w:clear="all"/>
+        <w:br/>
       </w:r>
       <w:bookmarkStart w:id="35" w:name="_topic_ToolsMenu"/>
       <w:bookmarkEnd w:id="35"/>
@@ -11815,7 +11419,6 @@
           <w:color w:val="4F81BD"/>
           <w:sz w:val="22"/>
         </w:rPr>
-        <w:br w:type="page"/>
       </w:r>
     </w:p>
     <w:p>
@@ -11846,7 +11449,6 @@
           <w:color w:val="4F81BD"/>
           <w:sz w:val="22"/>
         </w:rPr>
-        <w:lastRenderedPageBreak/>
         <w:t>Tools Menu</w:t>
       </w:r>
       <w:bookmarkEnd w:id="36"/>
@@ -11883,7 +11485,7 @@
           <w:rFonts w:ascii="Times New Roman" w:eastAsia="Times New Roman" w:hAnsi="Times New Roman" w:cs="Times New Roman"/>
           <w:color w:val="000000"/>
         </w:rPr>
-        <w:t>The </w:t>
+        <w:t xml:space="preserve">The </w:t>
       </w:r>
       <w:r>
         <w:rPr>
@@ -11898,7 +11500,7 @@
           <w:rFonts w:ascii="Times New Roman" w:eastAsia="Times New Roman" w:hAnsi="Times New Roman" w:cs="Times New Roman"/>
           <w:color w:val="000000"/>
         </w:rPr>
-        <w:t> menu provides access to several powerful built-in utilities that enhance gameplay, provide planning support, and offer diagnostic tools.</w:t>
+        <w:t xml:space="preserve"> menu provides access to several powerful built-in utilities that enhance gameplay, provide planning support, and offer diagnostic tools.</w:t>
       </w:r>
     </w:p>
     <w:p>
@@ -11906,41 +11508,6 @@
         <w:rPr>
           <w:noProof/>
         </w:rPr>
-        <w:drawing>
-          <wp:inline distT="0" distB="0" distL="0" distR="0" wp14:anchorId="4D52E0B2" wp14:editId="7F82E6CD">
-            <wp:extent cx="3333750" cy="2914650"/>
-            <wp:effectExtent l="0" t="0" r="0" b="0"/>
-            <wp:docPr id="14" name="Pic 14" title="Tools Menu Options"/>
-            <wp:cNvGraphicFramePr>
-              <a:graphicFrameLocks xmlns:a="http://schemas.openxmlformats.org/drawingml/2006/main" noChangeAspect="1"/>
-            </wp:cNvGraphicFramePr>
-            <a:graphic xmlns:a="http://schemas.openxmlformats.org/drawingml/2006/main">
-              <a:graphicData uri="http://schemas.openxmlformats.org/drawingml/2006/picture">
-                <pic:pic xmlns:pic="http://schemas.openxmlformats.org/drawingml/2006/picture">
-                  <pic:nvPicPr>
-                    <pic:cNvPr id="0" name="img14.png"/>
-                    <pic:cNvPicPr/>
-                  </pic:nvPicPr>
-                  <pic:blipFill>
-                    <a:blip r:embed="rId30" cstate="print"/>
-                    <a:stretch>
-                      <a:fillRect/>
-                    </a:stretch>
-                  </pic:blipFill>
-                  <pic:spPr>
-                    <a:xfrm>
-                      <a:off x="0" y="0"/>
-                      <a:ext cx="3333750" cy="2914650"/>
-                    </a:xfrm>
-                    <a:prstGeom prst="rect">
-                      <a:avLst/>
-                    </a:prstGeom>
-                  </pic:spPr>
-                </pic:pic>
-              </a:graphicData>
-            </a:graphic>
-          </wp:inline>
-        </w:drawing>
       </w:r>
     </w:p>
     <w:p>
@@ -11984,7 +11551,7 @@
           <w:rFonts w:ascii="Times New Roman" w:eastAsia="Times New Roman" w:hAnsi="Times New Roman" w:cs="Times New Roman"/>
           <w:color w:val="000000"/>
         </w:rPr>
-        <w:t> – View and inspect the app's live SQLite database.</w:t>
+        <w:t xml:space="preserve"> – View and inspect the app's live SQLite database.</w:t>
       </w:r>
     </w:p>
     <w:p>
@@ -12050,7 +11617,7 @@
           <w:rFonts w:ascii="Times New Roman" w:eastAsia="Times New Roman" w:hAnsi="Times New Roman" w:cs="Times New Roman"/>
           <w:color w:val="000000"/>
         </w:rPr>
-        <w:t> – Track what items your vampire needs based on usage.</w:t>
+        <w:t xml:space="preserve"> – Track what items your vampire needs based on usage.</w:t>
       </w:r>
     </w:p>
     <w:p>
@@ -12075,7 +11642,7 @@
           <w:rFonts w:ascii="Times New Roman" w:eastAsia="Times New Roman" w:hAnsi="Times New Roman" w:cs="Times New Roman"/>
           <w:color w:val="000000"/>
         </w:rPr>
-        <w:t> – Estimate coin cost to drain blood from another vampire.</w:t>
+        <w:t xml:space="preserve"> – Estimate coin cost to drain blood from another vampire.</w:t>
       </w:r>
     </w:p>
     <w:p>
@@ -12101,7 +11668,7 @@
           <w:rFonts w:ascii="Times New Roman" w:eastAsia="Times New Roman" w:hAnsi="Times New Roman" w:cs="Times New Roman"/>
           <w:color w:val="000000"/>
         </w:rPr>
-        <w:t> – Browse detailed logs of application activity and debug info.</w:t>
+        <w:t xml:space="preserve"> – Browse detailed logs of application activity and debug info.</w:t>
       </w:r>
     </w:p>
     <w:p>
@@ -12141,7 +11708,7 @@
         <w:rPr>
           <w:sz w:val="1"/>
         </w:rPr>
-        <w:br w:type="textWrapping" w:clear="all"/>
+        <w:br/>
       </w:r>
       <w:r>
         <w:rPr>
@@ -12203,7 +11770,7 @@
         <w:rPr>
           <w:sz w:val="1"/>
         </w:rPr>
-        <w:br w:type="textWrapping" w:clear="all"/>
+        <w:br/>
       </w:r>
       <w:bookmarkStart w:id="39" w:name="_topic_DatabaseViewer"/>
       <w:bookmarkEnd w:id="39"/>
@@ -12222,7 +11789,6 @@
           <w:color w:val="4F81BD"/>
           <w:sz w:val="22"/>
         </w:rPr>
-        <w:br w:type="page"/>
       </w:r>
     </w:p>
     <w:p>
@@ -12250,7 +11816,6 @@
           <w:color w:val="4F81BD"/>
           <w:sz w:val="22"/>
         </w:rPr>
-        <w:lastRenderedPageBreak/>
         <w:t>Database Viewer</w:t>
       </w:r>
     </w:p>
@@ -12286,7 +11851,7 @@
           <w:rFonts w:ascii="Times New Roman" w:eastAsia="Times New Roman" w:hAnsi="Times New Roman" w:cs="Times New Roman"/>
           <w:color w:val="000000"/>
         </w:rPr>
-        <w:t>The </w:t>
+        <w:t xml:space="preserve">The </w:t>
       </w:r>
       <w:r>
         <w:rPr>
@@ -12325,41 +11890,6 @@
         <w:rPr>
           <w:noProof/>
         </w:rPr>
-        <w:drawing>
-          <wp:inline distT="0" distB="0" distL="0" distR="0" wp14:anchorId="5BDD3404" wp14:editId="50216CDF">
-            <wp:extent cx="5715000" cy="4495800"/>
-            <wp:effectExtent l="0" t="0" r="0" b="0"/>
-            <wp:docPr id="15" name="Pic 15" title="Database Viewer Dialog"/>
-            <wp:cNvGraphicFramePr>
-              <a:graphicFrameLocks xmlns:a="http://schemas.openxmlformats.org/drawingml/2006/main" noChangeAspect="1"/>
-            </wp:cNvGraphicFramePr>
-            <a:graphic xmlns:a="http://schemas.openxmlformats.org/drawingml/2006/main">
-              <a:graphicData uri="http://schemas.openxmlformats.org/drawingml/2006/picture">
-                <pic:pic xmlns:pic="http://schemas.openxmlformats.org/drawingml/2006/picture">
-                  <pic:nvPicPr>
-                    <pic:cNvPr id="0" name="img15.png"/>
-                    <pic:cNvPicPr/>
-                  </pic:nvPicPr>
-                  <pic:blipFill>
-                    <a:blip r:embed="rId32" cstate="print"/>
-                    <a:stretch>
-                      <a:fillRect/>
-                    </a:stretch>
-                  </pic:blipFill>
-                  <pic:spPr>
-                    <a:xfrm>
-                      <a:off x="0" y="0"/>
-                      <a:ext cx="5715000" cy="4495800"/>
-                    </a:xfrm>
-                    <a:prstGeom prst="rect">
-                      <a:avLst/>
-                    </a:prstGeom>
-                  </pic:spPr>
-                </pic:pic>
-              </a:graphicData>
-            </a:graphic>
-          </wp:inline>
-        </w:drawing>
       </w:r>
     </w:p>
     <w:p>
@@ -12478,7 +12008,7 @@
           <w:rFonts w:ascii="Times New Roman" w:eastAsia="Times New Roman" w:hAnsi="Times New Roman" w:cs="Times New Roman"/>
           <w:color w:val="000000"/>
         </w:rPr>
-        <w:t>, </w:t>
+        <w:t xml:space="preserve">, </w:t>
       </w:r>
       <w:r>
         <w:rPr>
@@ -12524,7 +12054,7 @@
           <w:rFonts w:ascii="Times New Roman" w:eastAsia="Times New Roman" w:hAnsi="Times New Roman" w:cs="Times New Roman"/>
           <w:color w:val="000000"/>
         </w:rPr>
-        <w:t>, </w:t>
+        <w:t xml:space="preserve">, </w:t>
       </w:r>
       <w:proofErr w:type="spellStart"/>
       <w:r>
@@ -12555,7 +12085,7 @@
           <w:rFonts w:ascii="Times New Roman" w:eastAsia="Times New Roman" w:hAnsi="Times New Roman" w:cs="Times New Roman"/>
           <w:color w:val="000000"/>
         </w:rPr>
-        <w:t>, </w:t>
+        <w:t xml:space="preserve">, </w:t>
       </w:r>
       <w:proofErr w:type="spellStart"/>
       <w:r>
@@ -12662,7 +12192,6 @@
           <w:rStyle w:val="HTMLCode"/>
           <w:color w:val="000000"/>
         </w:rPr>
-        <w:lastRenderedPageBreak/>
         <w:t>settings</w:t>
       </w:r>
     </w:p>
@@ -12685,7 +12214,7 @@
           <w:rFonts w:ascii="Times New Roman" w:eastAsia="Times New Roman" w:hAnsi="Times New Roman" w:cs="Times New Roman"/>
           <w:color w:val="000000"/>
         </w:rPr>
-        <w:t>, </w:t>
+        <w:t xml:space="preserve">, </w:t>
       </w:r>
       <w:proofErr w:type="spellStart"/>
       <w:r>
@@ -12827,7 +12356,7 @@
           <w:rFonts w:ascii="Times New Roman" w:eastAsia="Times New Roman" w:hAnsi="Times New Roman" w:cs="Times New Roman"/>
           <w:color w:val="000000"/>
         </w:rPr>
-        <w:t>This dialog is </w:t>
+        <w:t xml:space="preserve">This dialog is </w:t>
       </w:r>
       <w:r>
         <w:rPr>
@@ -12842,7 +12371,7 @@
           <w:rFonts w:ascii="Times New Roman" w:eastAsia="Times New Roman" w:hAnsi="Times New Roman" w:cs="Times New Roman"/>
           <w:color w:val="000000"/>
         </w:rPr>
-        <w:t>. For advanced editing, you can open </w:t>
+        <w:t xml:space="preserve">. For advanced editing, you can open </w:t>
       </w:r>
       <w:proofErr w:type="spellStart"/>
       <w:r>
@@ -12858,7 +12387,7 @@
           <w:rFonts w:ascii="Times New Roman" w:eastAsia="Times New Roman" w:hAnsi="Times New Roman" w:cs="Times New Roman"/>
           <w:color w:val="000000"/>
         </w:rPr>
-        <w:t> (located in: </w:t>
+        <w:t xml:space="preserve"> (located in: </w:t>
       </w:r>
       <w:r>
         <w:rPr>
@@ -12888,7 +12417,7 @@
           <w:rFonts w:ascii="Times New Roman" w:eastAsia="Times New Roman" w:hAnsi="Times New Roman" w:cs="Times New Roman"/>
           <w:color w:val="000000"/>
         </w:rPr>
-        <w:t>) using tools like </w:t>
+        <w:t xml:space="preserve">) using tools like </w:t>
       </w:r>
       <w:hyperlink r:id="rId33">
         <w:r>
@@ -12929,7 +12458,7 @@
         <w:rPr>
           <w:sz w:val="1"/>
         </w:rPr>
-        <w:br w:type="textWrapping" w:clear="all"/>
+        <w:br/>
       </w:r>
       <w:r>
         <w:rPr>
@@ -12991,7 +12520,7 @@
         <w:rPr>
           <w:sz w:val="1"/>
         </w:rPr>
-        <w:br w:type="textWrapping" w:clear="all"/>
+        <w:br/>
       </w:r>
       <w:bookmarkStart w:id="44" w:name="_topic_PowersReference"/>
       <w:bookmarkEnd w:id="44"/>
@@ -13010,7 +12539,6 @@
           <w:color w:val="4F81BD"/>
           <w:sz w:val="22"/>
         </w:rPr>
-        <w:br w:type="page"/>
       </w:r>
     </w:p>
     <w:p>
@@ -13038,7 +12566,6 @@
           <w:color w:val="4F81BD"/>
           <w:sz w:val="22"/>
         </w:rPr>
-        <w:lastRenderedPageBreak/>
         <w:t>Powers Reference</w:t>
       </w:r>
     </w:p>
@@ -13074,7 +12601,7 @@
           <w:rFonts w:ascii="Times New Roman" w:eastAsia="Times New Roman" w:hAnsi="Times New Roman" w:cs="Times New Roman"/>
           <w:color w:val="000000"/>
         </w:rPr>
-        <w:t>The </w:t>
+        <w:t xml:space="preserve">The </w:t>
       </w:r>
       <w:r>
         <w:rPr>
@@ -13113,41 +12640,6 @@
         <w:rPr>
           <w:noProof/>
         </w:rPr>
-        <w:drawing>
-          <wp:inline distT="0" distB="0" distL="0" distR="0" wp14:anchorId="2D5A84AC" wp14:editId="04A09647">
-            <wp:extent cx="4762500" cy="5133975"/>
-            <wp:effectExtent l="0" t="0" r="0" b="0"/>
-            <wp:docPr id="16" name="Pic 16" title="Powers Reference Dialog"/>
-            <wp:cNvGraphicFramePr>
-              <a:graphicFrameLocks xmlns:a="http://schemas.openxmlformats.org/drawingml/2006/main" noChangeAspect="1"/>
-            </wp:cNvGraphicFramePr>
-            <a:graphic xmlns:a="http://schemas.openxmlformats.org/drawingml/2006/main">
-              <a:graphicData uri="http://schemas.openxmlformats.org/drawingml/2006/picture">
-                <pic:pic xmlns:pic="http://schemas.openxmlformats.org/drawingml/2006/picture">
-                  <pic:nvPicPr>
-                    <pic:cNvPr id="0" name="img16.png"/>
-                    <pic:cNvPicPr/>
-                  </pic:nvPicPr>
-                  <pic:blipFill>
-                    <a:blip r:embed="rId35" cstate="print"/>
-                    <a:stretch>
-                      <a:fillRect/>
-                    </a:stretch>
-                  </pic:blipFill>
-                  <pic:spPr>
-                    <a:xfrm>
-                      <a:off x="0" y="0"/>
-                      <a:ext cx="4762500" cy="5133975"/>
-                    </a:xfrm>
-                    <a:prstGeom prst="rect">
-                      <a:avLst/>
-                    </a:prstGeom>
-                  </pic:spPr>
-                </pic:pic>
-              </a:graphicData>
-            </a:graphic>
-          </wp:inline>
-        </w:drawing>
       </w:r>
     </w:p>
     <w:p>
@@ -13189,7 +12681,7 @@
           <w:rFonts w:ascii="Times New Roman" w:eastAsia="Times New Roman" w:hAnsi="Times New Roman" w:cs="Times New Roman"/>
           <w:color w:val="000000"/>
         </w:rPr>
-        <w:t> All current powers are listed on the left side, including all levels (e.g., Locate 1–3, Telepathy 1–3).</w:t>
+        <w:t xml:space="preserve"> All current powers are listed on the left side, including all levels (e.g., Locate 1–3, Telepathy 1–3).</w:t>
       </w:r>
     </w:p>
     <w:p>
@@ -13251,7 +12743,7 @@
           <w:rFonts w:ascii="Times New Roman" w:eastAsia="Times New Roman" w:hAnsi="Times New Roman" w:cs="Times New Roman"/>
           <w:color w:val="000000"/>
         </w:rPr>
-        <w:t> The name of the selected power.</w:t>
+        <w:t xml:space="preserve"> The name of the selected power.</w:t>
       </w:r>
     </w:p>
     <w:p>
@@ -13274,7 +12766,7 @@
           <w:rFonts w:ascii="Times New Roman" w:eastAsia="Times New Roman" w:hAnsi="Times New Roman" w:cs="Times New Roman"/>
           <w:color w:val="000000"/>
         </w:rPr>
-        <w:t> The name of the guild that grants this power.</w:t>
+        <w:t xml:space="preserve"> The name of the guild that grants this power.</w:t>
       </w:r>
     </w:p>
     <w:p>
@@ -13297,7 +12789,7 @@
           <w:rFonts w:ascii="Times New Roman" w:eastAsia="Times New Roman" w:hAnsi="Times New Roman" w:cs="Times New Roman"/>
           <w:color w:val="000000"/>
         </w:rPr>
-        <w:t> The number of coins required to purchase it.</w:t>
+        <w:t xml:space="preserve"> The number of coins required to purchase it.</w:t>
       </w:r>
     </w:p>
     <w:p>
@@ -13320,7 +12812,7 @@
           <w:rFonts w:ascii="Times New Roman" w:eastAsia="Times New Roman" w:hAnsi="Times New Roman" w:cs="Times New Roman"/>
           <w:color w:val="000000"/>
         </w:rPr>
-        <w:t> A brief description of any quest or task needed to unlock it (if applicable).</w:t>
+        <w:t xml:space="preserve"> A brief description of any quest or task needed to unlock it (if applicable).</w:t>
       </w:r>
     </w:p>
     <w:p>
@@ -13433,7 +12925,6 @@
           <w:rFonts w:ascii="Times New Roman" w:eastAsia="Times New Roman" w:hAnsi="Times New Roman" w:cs="Times New Roman"/>
           <w:color w:val="000000"/>
         </w:rPr>
-        <w:lastRenderedPageBreak/>
         <w:t>Notes:</w:t>
       </w:r>
       <w:bookmarkEnd w:id="47"/>
@@ -13506,7 +12997,7 @@
         <w:rPr>
           <w:sz w:val="1"/>
         </w:rPr>
-        <w:br w:type="textWrapping" w:clear="all"/>
+        <w:br/>
       </w:r>
       <w:r>
         <w:rPr>
@@ -13568,7 +13059,7 @@
         <w:rPr>
           <w:sz w:val="1"/>
         </w:rPr>
-        <w:br w:type="textWrapping" w:clear="all"/>
+        <w:br/>
       </w:r>
       <w:bookmarkStart w:id="48" w:name="_topic_ShoppingListGenerator"/>
       <w:bookmarkEnd w:id="48"/>
@@ -13587,7 +13078,6 @@
           <w:color w:val="4F81BD"/>
           <w:sz w:val="22"/>
         </w:rPr>
-        <w:br w:type="page"/>
       </w:r>
     </w:p>
     <w:p>
@@ -13615,7 +13105,6 @@
           <w:color w:val="4F81BD"/>
           <w:sz w:val="22"/>
         </w:rPr>
-        <w:lastRenderedPageBreak/>
         <w:t>Shopping List Generator</w:t>
       </w:r>
     </w:p>
@@ -13651,7 +13140,7 @@
           <w:rFonts w:ascii="Times New Roman" w:eastAsia="Times New Roman" w:hAnsi="Times New Roman" w:cs="Times New Roman"/>
           <w:color w:val="000000"/>
         </w:rPr>
-        <w:t>The </w:t>
+        <w:t xml:space="preserve">The </w:t>
       </w:r>
       <w:r>
         <w:rPr>
@@ -13666,7 +13155,7 @@
           <w:rFonts w:ascii="Times New Roman" w:eastAsia="Times New Roman" w:hAnsi="Times New Roman" w:cs="Times New Roman"/>
           <w:color w:val="000000"/>
         </w:rPr>
-        <w:t> helps you calculate and plan coin expenditures before you visit a shop. It allows you to preview shop inventories, adjust for your Charisma level, and total the cost of your purchases. It’s especially helpful before withdrawing coins from the bank.</w:t>
+        <w:t xml:space="preserve"> helps you calculate and plan coin expenditures before you visit a shop. It allows you to preview shop inventories, adjust for your Charisma level, and total the cost of your purchases. It’s especially helpful before withdrawing coins from the bank.</w:t>
       </w:r>
     </w:p>
     <w:p>
@@ -13711,41 +13200,6 @@
         <w:rPr>
           <w:noProof/>
         </w:rPr>
-        <w:drawing>
-          <wp:inline distT="0" distB="0" distL="0" distR="0" wp14:anchorId="1FB1C277" wp14:editId="017E0A34">
-            <wp:extent cx="3810000" cy="2733675"/>
-            <wp:effectExtent l="0" t="0" r="0" b="0"/>
-            <wp:docPr id="17" name="Pic 17" title="Select Shop"/>
-            <wp:cNvGraphicFramePr>
-              <a:graphicFrameLocks xmlns:a="http://schemas.openxmlformats.org/drawingml/2006/main" noChangeAspect="1"/>
-            </wp:cNvGraphicFramePr>
-            <a:graphic xmlns:a="http://schemas.openxmlformats.org/drawingml/2006/main">
-              <a:graphicData uri="http://schemas.openxmlformats.org/drawingml/2006/picture">
-                <pic:pic xmlns:pic="http://schemas.openxmlformats.org/drawingml/2006/picture">
-                  <pic:nvPicPr>
-                    <pic:cNvPr id="0" name="img17.png"/>
-                    <pic:cNvPicPr/>
-                  </pic:nvPicPr>
-                  <pic:blipFill>
-                    <a:blip r:embed="rId37" cstate="print"/>
-                    <a:stretch>
-                      <a:fillRect/>
-                    </a:stretch>
-                  </pic:blipFill>
-                  <pic:spPr>
-                    <a:xfrm>
-                      <a:off x="0" y="0"/>
-                      <a:ext cx="3810000" cy="2733675"/>
-                    </a:xfrm>
-                    <a:prstGeom prst="rect">
-                      <a:avLst/>
-                    </a:prstGeom>
-                  </pic:spPr>
-                </pic:pic>
-              </a:graphicData>
-            </a:graphic>
-          </wp:inline>
-        </w:drawing>
       </w:r>
     </w:p>
     <w:p>
@@ -13787,41 +13241,6 @@
         <w:rPr>
           <w:noProof/>
         </w:rPr>
-        <w:drawing>
-          <wp:inline distT="0" distB="0" distL="0" distR="0" wp14:anchorId="5B5A1E7E" wp14:editId="2B50AB0E">
-            <wp:extent cx="3810000" cy="2733675"/>
-            <wp:effectExtent l="0" t="0" r="0" b="0"/>
-            <wp:docPr id="18" name="Pic 18" title="Select Charisma Level"/>
-            <wp:cNvGraphicFramePr>
-              <a:graphicFrameLocks xmlns:a="http://schemas.openxmlformats.org/drawingml/2006/main" noChangeAspect="1"/>
-            </wp:cNvGraphicFramePr>
-            <a:graphic xmlns:a="http://schemas.openxmlformats.org/drawingml/2006/main">
-              <a:graphicData uri="http://schemas.openxmlformats.org/drawingml/2006/picture">
-                <pic:pic xmlns:pic="http://schemas.openxmlformats.org/drawingml/2006/picture">
-                  <pic:nvPicPr>
-                    <pic:cNvPr id="0" name="img18.png"/>
-                    <pic:cNvPicPr/>
-                  </pic:nvPicPr>
-                  <pic:blipFill>
-                    <a:blip r:embed="rId38" cstate="print"/>
-                    <a:stretch>
-                      <a:fillRect/>
-                    </a:stretch>
-                  </pic:blipFill>
-                  <pic:spPr>
-                    <a:xfrm>
-                      <a:off x="0" y="0"/>
-                      <a:ext cx="3810000" cy="2733675"/>
-                    </a:xfrm>
-                    <a:prstGeom prst="rect">
-                      <a:avLst/>
-                    </a:prstGeom>
-                  </pic:spPr>
-                </pic:pic>
-              </a:graphicData>
-            </a:graphic>
-          </wp:inline>
-        </w:drawing>
       </w:r>
     </w:p>
     <w:p>
@@ -13837,7 +13256,7 @@
           <w:rFonts w:ascii="Times New Roman" w:eastAsia="Times New Roman" w:hAnsi="Times New Roman" w:cs="Times New Roman"/>
           <w:color w:val="000000"/>
         </w:rPr>
-        <w:t>Select your vampire’s current </w:t>
+        <w:t xml:space="preserve">Select your vampire’s current </w:t>
       </w:r>
       <w:r>
         <w:rPr>
@@ -13894,42 +13313,6 @@
         <w:rPr>
           <w:noProof/>
         </w:rPr>
-        <w:lastRenderedPageBreak/>
-        <w:drawing>
-          <wp:inline distT="0" distB="0" distL="0" distR="0" wp14:anchorId="50BF10E0" wp14:editId="4CF74494">
-            <wp:extent cx="3810000" cy="2724150"/>
-            <wp:effectExtent l="0" t="0" r="0" b="0"/>
-            <wp:docPr id="19" name="Pic 19" title="Enter Quantity"/>
-            <wp:cNvGraphicFramePr>
-              <a:graphicFrameLocks xmlns:a="http://schemas.openxmlformats.org/drawingml/2006/main" noChangeAspect="1"/>
-            </wp:cNvGraphicFramePr>
-            <a:graphic xmlns:a="http://schemas.openxmlformats.org/drawingml/2006/main">
-              <a:graphicData uri="http://schemas.openxmlformats.org/drawingml/2006/picture">
-                <pic:pic xmlns:pic="http://schemas.openxmlformats.org/drawingml/2006/picture">
-                  <pic:nvPicPr>
-                    <pic:cNvPr id="0" name="img19.png"/>
-                    <pic:cNvPicPr/>
-                  </pic:nvPicPr>
-                  <pic:blipFill>
-                    <a:blip r:embed="rId39" cstate="print"/>
-                    <a:stretch>
-                      <a:fillRect/>
-                    </a:stretch>
-                  </pic:blipFill>
-                  <pic:spPr>
-                    <a:xfrm>
-                      <a:off x="0" y="0"/>
-                      <a:ext cx="3810000" cy="2724150"/>
-                    </a:xfrm>
-                    <a:prstGeom prst="rect">
-                      <a:avLst/>
-                    </a:prstGeom>
-                  </pic:spPr>
-                </pic:pic>
-              </a:graphicData>
-            </a:graphic>
-          </wp:inline>
-        </w:drawing>
       </w:r>
     </w:p>
     <w:p>
@@ -13945,7 +13328,7 @@
           <w:rFonts w:ascii="Times New Roman" w:eastAsia="Times New Roman" w:hAnsi="Times New Roman" w:cs="Times New Roman"/>
           <w:color w:val="000000"/>
         </w:rPr>
-        <w:t>Select an item from the shop list and click </w:t>
+        <w:t xml:space="preserve">Select an item from the shop list and click </w:t>
       </w:r>
       <w:r>
         <w:rPr>
@@ -13986,41 +13369,6 @@
         <w:rPr>
           <w:noProof/>
         </w:rPr>
-        <w:drawing>
-          <wp:inline distT="0" distB="0" distL="0" distR="0" wp14:anchorId="450ECE7D" wp14:editId="64145A63">
-            <wp:extent cx="3810000" cy="2733675"/>
-            <wp:effectExtent l="0" t="0" r="0" b="0"/>
-            <wp:docPr id="20" name="Pic 20" title="Shopping List View"/>
-            <wp:cNvGraphicFramePr>
-              <a:graphicFrameLocks xmlns:a="http://schemas.openxmlformats.org/drawingml/2006/main" noChangeAspect="1"/>
-            </wp:cNvGraphicFramePr>
-            <a:graphic xmlns:a="http://schemas.openxmlformats.org/drawingml/2006/main">
-              <a:graphicData uri="http://schemas.openxmlformats.org/drawingml/2006/picture">
-                <pic:pic xmlns:pic="http://schemas.openxmlformats.org/drawingml/2006/picture">
-                  <pic:nvPicPr>
-                    <pic:cNvPr id="0" name="img20.png"/>
-                    <pic:cNvPicPr/>
-                  </pic:nvPicPr>
-                  <pic:blipFill>
-                    <a:blip r:embed="rId40" cstate="print"/>
-                    <a:stretch>
-                      <a:fillRect/>
-                    </a:stretch>
-                  </pic:blipFill>
-                  <pic:spPr>
-                    <a:xfrm>
-                      <a:off x="0" y="0"/>
-                      <a:ext cx="3810000" cy="2733675"/>
-                    </a:xfrm>
-                    <a:prstGeom prst="rect">
-                      <a:avLst/>
-                    </a:prstGeom>
-                  </pic:spPr>
-                </pic:pic>
-              </a:graphicData>
-            </a:graphic>
-          </wp:inline>
-        </w:drawing>
       </w:r>
     </w:p>
     <w:p>
@@ -14093,7 +13441,7 @@
           <w:rFonts w:ascii="Times New Roman" w:eastAsia="Times New Roman" w:hAnsi="Times New Roman" w:cs="Times New Roman"/>
           <w:color w:val="000000"/>
         </w:rPr>
-        <w:t> Combined cost of all selected items</w:t>
+        <w:t xml:space="preserve"> Combined cost of all selected items</w:t>
       </w:r>
     </w:p>
     <w:p>
@@ -14116,7 +13464,7 @@
           <w:rFonts w:ascii="Times New Roman" w:eastAsia="Times New Roman" w:hAnsi="Times New Roman" w:cs="Times New Roman"/>
           <w:color w:val="000000"/>
         </w:rPr>
-        <w:t> On-hand cash</w:t>
+        <w:t xml:space="preserve"> On-hand cash</w:t>
       </w:r>
     </w:p>
     <w:p>
@@ -14140,7 +13488,7 @@
           <w:rFonts w:ascii="Times New Roman" w:eastAsia="Times New Roman" w:hAnsi="Times New Roman" w:cs="Times New Roman"/>
           <w:color w:val="000000"/>
         </w:rPr>
-        <w:t> Stored coins in the bank</w:t>
+        <w:t xml:space="preserve"> Stored coins in the bank</w:t>
       </w:r>
     </w:p>
     <w:p>
@@ -14166,42 +13514,6 @@
         <w:rPr>
           <w:noProof/>
         </w:rPr>
-        <w:lastRenderedPageBreak/>
-        <w:drawing>
-          <wp:inline distT="0" distB="0" distL="0" distR="0" wp14:anchorId="7BDC8504" wp14:editId="55E7F0B9">
-            <wp:extent cx="3810000" cy="2743200"/>
-            <wp:effectExtent l="0" t="0" r="0" b="0"/>
-            <wp:docPr id="21" name="Pic 21" title="Remove Item Prompt"/>
-            <wp:cNvGraphicFramePr>
-              <a:graphicFrameLocks xmlns:a="http://schemas.openxmlformats.org/drawingml/2006/main" noChangeAspect="1"/>
-            </wp:cNvGraphicFramePr>
-            <a:graphic xmlns:a="http://schemas.openxmlformats.org/drawingml/2006/main">
-              <a:graphicData uri="http://schemas.openxmlformats.org/drawingml/2006/picture">
-                <pic:pic xmlns:pic="http://schemas.openxmlformats.org/drawingml/2006/picture">
-                  <pic:nvPicPr>
-                    <pic:cNvPr id="0" name="img21.png"/>
-                    <pic:cNvPicPr/>
-                  </pic:nvPicPr>
-                  <pic:blipFill>
-                    <a:blip r:embed="rId41" cstate="print"/>
-                    <a:stretch>
-                      <a:fillRect/>
-                    </a:stretch>
-                  </pic:blipFill>
-                  <pic:spPr>
-                    <a:xfrm>
-                      <a:off x="0" y="0"/>
-                      <a:ext cx="3810000" cy="2743200"/>
-                    </a:xfrm>
-                    <a:prstGeom prst="rect">
-                      <a:avLst/>
-                    </a:prstGeom>
-                  </pic:spPr>
-                </pic:pic>
-              </a:graphicData>
-            </a:graphic>
-          </wp:inline>
-        </w:drawing>
       </w:r>
     </w:p>
     <w:p>
@@ -14217,7 +13529,7 @@
           <w:rFonts w:ascii="Times New Roman" w:eastAsia="Times New Roman" w:hAnsi="Times New Roman" w:cs="Times New Roman"/>
           <w:color w:val="000000"/>
         </w:rPr>
-        <w:t>Select an item and click </w:t>
+        <w:t xml:space="preserve">Select an item and click </w:t>
       </w:r>
       <w:r>
         <w:rPr>
@@ -14307,7 +13619,7 @@
         <w:rPr>
           <w:sz w:val="1"/>
         </w:rPr>
-        <w:br w:type="textWrapping" w:clear="all"/>
+        <w:br/>
       </w:r>
       <w:r>
         <w:rPr>
@@ -14405,7 +13717,7 @@
         <w:rPr>
           <w:sz w:val="1"/>
         </w:rPr>
-        <w:br w:type="textWrapping" w:clear="all"/>
+        <w:br/>
       </w:r>
       <w:bookmarkStart w:id="52" w:name="_topic_DamageCalculator"/>
       <w:bookmarkEnd w:id="52"/>
@@ -14424,7 +13736,6 @@
           <w:color w:val="4F81BD"/>
           <w:sz w:val="22"/>
         </w:rPr>
-        <w:br w:type="page"/>
       </w:r>
     </w:p>
     <w:p>
@@ -14452,7 +13763,6 @@
           <w:color w:val="4F81BD"/>
           <w:sz w:val="22"/>
         </w:rPr>
-        <w:lastRenderedPageBreak/>
         <w:t>Damage Calculator</w:t>
       </w:r>
     </w:p>
@@ -14488,7 +13798,7 @@
           <w:rFonts w:ascii="Times New Roman" w:eastAsia="Times New Roman" w:hAnsi="Times New Roman" w:cs="Times New Roman"/>
           <w:color w:val="000000"/>
         </w:rPr>
-        <w:t>The </w:t>
+        <w:t xml:space="preserve">The </w:t>
       </w:r>
       <w:r>
         <w:rPr>
@@ -14503,7 +13813,7 @@
           <w:rFonts w:ascii="Times New Roman" w:eastAsia="Times New Roman" w:hAnsi="Times New Roman" w:cs="Times New Roman"/>
           <w:color w:val="000000"/>
         </w:rPr>
-        <w:t> estimates the number and type of weapons needed to inflict a target amount of blood damage on another vampire, based on your Charisma level. It automatically calculates which items to buy from Discount Magic and how many hits are required.</w:t>
+        <w:t xml:space="preserve"> estimates the number and type of weapons needed to inflict a target amount of blood damage on another vampire, based on your Charisma level. It automatically calculates which items to buy from Discount Magic and how many hits are required.</w:t>
       </w:r>
     </w:p>
     <w:p>
@@ -14511,41 +13821,6 @@
         <w:rPr>
           <w:noProof/>
         </w:rPr>
-        <w:drawing>
-          <wp:inline distT="0" distB="0" distL="0" distR="0" wp14:anchorId="3E0AD63A" wp14:editId="40C953ED">
-            <wp:extent cx="3333750" cy="2943225"/>
-            <wp:effectExtent l="0" t="0" r="0" b="0"/>
-            <wp:docPr id="22" name="Pic 22" title="Damage Calculator Dialog"/>
-            <wp:cNvGraphicFramePr>
-              <a:graphicFrameLocks xmlns:a="http://schemas.openxmlformats.org/drawingml/2006/main" noChangeAspect="1"/>
-            </wp:cNvGraphicFramePr>
-            <a:graphic xmlns:a="http://schemas.openxmlformats.org/drawingml/2006/main">
-              <a:graphicData uri="http://schemas.openxmlformats.org/drawingml/2006/picture">
-                <pic:pic xmlns:pic="http://schemas.openxmlformats.org/drawingml/2006/picture">
-                  <pic:nvPicPr>
-                    <pic:cNvPr id="0" name="img22.png"/>
-                    <pic:cNvPicPr/>
-                  </pic:nvPicPr>
-                  <pic:blipFill>
-                    <a:blip r:embed="rId43" cstate="print"/>
-                    <a:stretch>
-                      <a:fillRect/>
-                    </a:stretch>
-                  </pic:blipFill>
-                  <pic:spPr>
-                    <a:xfrm>
-                      <a:off x="0" y="0"/>
-                      <a:ext cx="3333750" cy="2943225"/>
-                    </a:xfrm>
-                    <a:prstGeom prst="rect">
-                      <a:avLst/>
-                    </a:prstGeom>
-                  </pic:spPr>
-                </pic:pic>
-              </a:graphicData>
-            </a:graphic>
-          </wp:inline>
-        </w:drawing>
       </w:r>
     </w:p>
     <w:p>
@@ -14587,7 +13862,7 @@
           <w:rFonts w:ascii="Times New Roman" w:eastAsia="Times New Roman" w:hAnsi="Times New Roman" w:cs="Times New Roman"/>
           <w:color w:val="000000"/>
         </w:rPr>
-        <w:t> Type in how much blood you want to drain from your target.</w:t>
+        <w:t xml:space="preserve"> Type in how much blood you want to drain from your target.</w:t>
       </w:r>
     </w:p>
     <w:p>
@@ -14610,7 +13885,7 @@
           <w:rFonts w:ascii="Times New Roman" w:eastAsia="Times New Roman" w:hAnsi="Times New Roman" w:cs="Times New Roman"/>
           <w:color w:val="000000"/>
         </w:rPr>
-        <w:t> Choose your current Charisma level (affects cost reductions).</w:t>
+        <w:t xml:space="preserve"> Choose your current Charisma level (affects cost reductions).</w:t>
       </w:r>
     </w:p>
     <w:p>
@@ -14633,7 +13908,7 @@
           <w:rFonts w:ascii="Times New Roman" w:eastAsia="Times New Roman" w:hAnsi="Times New Roman" w:cs="Times New Roman"/>
           <w:color w:val="000000"/>
         </w:rPr>
-        <w:t> The dialog will show:</w:t>
+        <w:t xml:space="preserve"> The dialog will show:</w:t>
       </w:r>
     </w:p>
     <w:p>
@@ -14728,7 +14003,7 @@
           <w:rFonts w:ascii="Times New Roman" w:eastAsia="Times New Roman" w:hAnsi="Times New Roman" w:cs="Times New Roman"/>
           <w:color w:val="000000"/>
         </w:rPr>
-        <w:t>Only considers item prices from </w:t>
+        <w:t xml:space="preserve">Only considers item prices from </w:t>
       </w:r>
       <w:r>
         <w:rPr>
@@ -14808,7 +14083,7 @@
         <w:rPr>
           <w:sz w:val="1"/>
         </w:rPr>
-        <w:br w:type="textWrapping" w:clear="all"/>
+        <w:br/>
       </w:r>
       <w:r>
         <w:rPr>
@@ -14880,7 +14155,7 @@
         <w:rPr>
           <w:sz w:val="1"/>
         </w:rPr>
-        <w:br w:type="textWrapping" w:clear="all"/>
+        <w:br/>
       </w:r>
       <w:bookmarkStart w:id="56" w:name="_topic_LogViewer"/>
       <w:bookmarkEnd w:id="56"/>
@@ -14899,7 +14174,6 @@
           <w:color w:val="4F81BD"/>
           <w:sz w:val="22"/>
         </w:rPr>
-        <w:br w:type="page"/>
       </w:r>
     </w:p>
     <w:p>
@@ -14927,7 +14201,6 @@
           <w:color w:val="4F81BD"/>
           <w:sz w:val="22"/>
         </w:rPr>
-        <w:lastRenderedPageBreak/>
         <w:t>Log Viewer</w:t>
       </w:r>
     </w:p>
@@ -14963,7 +14236,7 @@
           <w:rFonts w:ascii="Times New Roman" w:eastAsia="Times New Roman" w:hAnsi="Times New Roman" w:cs="Times New Roman"/>
           <w:color w:val="000000"/>
         </w:rPr>
-        <w:t>The </w:t>
+        <w:t xml:space="preserve">The </w:t>
       </w:r>
       <w:r>
         <w:rPr>
@@ -15002,41 +14275,6 @@
         <w:rPr>
           <w:noProof/>
         </w:rPr>
-        <w:drawing>
-          <wp:inline distT="0" distB="0" distL="0" distR="0" wp14:anchorId="06A5714F" wp14:editId="13F89EBF">
-            <wp:extent cx="4762500" cy="3333750"/>
-            <wp:effectExtent l="0" t="0" r="0" b="0"/>
-            <wp:docPr id="23" name="Pic 23" title="Log Viewer Dialog"/>
-            <wp:cNvGraphicFramePr>
-              <a:graphicFrameLocks xmlns:a="http://schemas.openxmlformats.org/drawingml/2006/main" noChangeAspect="1"/>
-            </wp:cNvGraphicFramePr>
-            <a:graphic xmlns:a="http://schemas.openxmlformats.org/drawingml/2006/main">
-              <a:graphicData uri="http://schemas.openxmlformats.org/drawingml/2006/picture">
-                <pic:pic xmlns:pic="http://schemas.openxmlformats.org/drawingml/2006/picture">
-                  <pic:nvPicPr>
-                    <pic:cNvPr id="0" name="img23.png"/>
-                    <pic:cNvPicPr/>
-                  </pic:nvPicPr>
-                  <pic:blipFill>
-                    <a:blip r:embed="rId45" cstate="print"/>
-                    <a:stretch>
-                      <a:fillRect/>
-                    </a:stretch>
-                  </pic:blipFill>
-                  <pic:spPr>
-                    <a:xfrm>
-                      <a:off x="0" y="0"/>
-                      <a:ext cx="4762500" cy="3333750"/>
-                    </a:xfrm>
-                    <a:prstGeom prst="rect">
-                      <a:avLst/>
-                    </a:prstGeom>
-                  </pic:spPr>
-                </pic:pic>
-              </a:graphicData>
-            </a:graphic>
-          </wp:inline>
-        </w:drawing>
       </w:r>
     </w:p>
     <w:p>
@@ -15078,7 +14316,7 @@
           <w:rFonts w:ascii="Times New Roman" w:eastAsia="Times New Roman" w:hAnsi="Times New Roman" w:cs="Times New Roman"/>
           <w:color w:val="000000"/>
         </w:rPr>
-        <w:t> All log files are displayed by date in the left panel.</w:t>
+        <w:t xml:space="preserve"> All log files are displayed by date in the left panel.</w:t>
       </w:r>
     </w:p>
     <w:p>
@@ -15101,7 +14339,7 @@
           <w:rFonts w:ascii="Times New Roman" w:eastAsia="Times New Roman" w:hAnsi="Times New Roman" w:cs="Times New Roman"/>
           <w:color w:val="000000"/>
         </w:rPr>
-        <w:t> Selecting a log file displays its full contents in the right panel.</w:t>
+        <w:t xml:space="preserve"> Selecting a log file displays its full contents in the right panel.</w:t>
       </w:r>
     </w:p>
     <w:p>
@@ -15124,7 +14362,7 @@
           <w:rFonts w:ascii="Times New Roman" w:eastAsia="Times New Roman" w:hAnsi="Times New Roman" w:cs="Times New Roman"/>
           <w:color w:val="000000"/>
         </w:rPr>
-        <w:t> Checkboxes let you show or hide lines by severity:</w:t>
+        <w:t xml:space="preserve"> Checkboxes let you show or hide lines by severity:</w:t>
       </w:r>
     </w:p>
     <w:p>
@@ -15223,7 +14461,7 @@
           <w:rFonts w:ascii="Times New Roman" w:eastAsia="Times New Roman" w:hAnsi="Times New Roman" w:cs="Times New Roman"/>
           <w:color w:val="000000"/>
         </w:rPr>
-        <w:t> Permanently removes the selected log file from disk.</w:t>
+        <w:t xml:space="preserve"> Permanently removes the selected log file from disk.</w:t>
       </w:r>
     </w:p>
     <w:p>
@@ -15337,7 +14575,7 @@
           <w:rFonts w:ascii="Times New Roman" w:eastAsia="Times New Roman" w:hAnsi="Times New Roman" w:cs="Times New Roman"/>
           <w:color w:val="000000"/>
         </w:rPr>
-        <w:t>Log files are stored in the </w:t>
+        <w:t xml:space="preserve">Log files are stored in the </w:t>
       </w:r>
       <w:r>
         <w:rPr>
@@ -15367,7 +14605,7 @@
           <w:rFonts w:ascii="Times New Roman" w:eastAsia="Times New Roman" w:hAnsi="Times New Roman" w:cs="Times New Roman"/>
           <w:color w:val="000000"/>
         </w:rPr>
-        <w:t> folder alongside the app.</w:t>
+        <w:t xml:space="preserve"> folder alongside the app.</w:t>
       </w:r>
     </w:p>
     <w:p>
@@ -15383,7 +14621,6 @@
           <w:rFonts w:ascii="Times New Roman" w:eastAsia="Times New Roman" w:hAnsi="Times New Roman" w:cs="Times New Roman"/>
           <w:color w:val="000000"/>
         </w:rPr>
-        <w:lastRenderedPageBreak/>
         <w:t xml:space="preserve">Logs are created new every day and will </w:t>
       </w:r>
       <w:proofErr w:type="gramStart"/>
@@ -15457,7 +14694,7 @@
         <w:rPr>
           <w:sz w:val="1"/>
         </w:rPr>
-        <w:br w:type="textWrapping" w:clear="all"/>
+        <w:br/>
       </w:r>
       <w:r>
         <w:rPr>
@@ -15538,7 +14775,7 @@
         <w:rPr>
           <w:sz w:val="1"/>
         </w:rPr>
-        <w:br w:type="textWrapping" w:clear="all"/>
+        <w:br/>
       </w:r>
       <w:bookmarkStart w:id="61" w:name="_topic_ResourcesMenu"/>
       <w:bookmarkEnd w:id="61"/>
@@ -15559,7 +14796,6 @@
           <w:color w:val="4F81BD"/>
           <w:sz w:val="22"/>
         </w:rPr>
-        <w:br w:type="page"/>
       </w:r>
     </w:p>
     <w:p>
@@ -15590,7 +14826,6 @@
           <w:color w:val="4F81BD"/>
           <w:sz w:val="22"/>
         </w:rPr>
-        <w:lastRenderedPageBreak/>
         <w:t>Resources Menu</w:t>
       </w:r>
       <w:bookmarkEnd w:id="62"/>
@@ -15627,7 +14862,7 @@
           <w:rFonts w:ascii="Times New Roman" w:eastAsia="Times New Roman" w:hAnsi="Times New Roman" w:cs="Times New Roman"/>
           <w:color w:val="000000"/>
         </w:rPr>
-        <w:t>The </w:t>
+        <w:t xml:space="preserve">The </w:t>
       </w:r>
       <w:r>
         <w:rPr>
@@ -15666,41 +14901,6 @@
         <w:rPr>
           <w:noProof/>
         </w:rPr>
-        <w:drawing>
-          <wp:inline distT="0" distB="0" distL="0" distR="0" wp14:anchorId="43EEBDF5" wp14:editId="38FA3F2A">
-            <wp:extent cx="2857500" cy="2571750"/>
-            <wp:effectExtent l="0" t="0" r="0" b="0"/>
-            <wp:docPr id="24" name="Pic 24" title="Resources Menu"/>
-            <wp:cNvGraphicFramePr>
-              <a:graphicFrameLocks xmlns:a="http://schemas.openxmlformats.org/drawingml/2006/main" noChangeAspect="1"/>
-            </wp:cNvGraphicFramePr>
-            <a:graphic xmlns:a="http://schemas.openxmlformats.org/drawingml/2006/main">
-              <a:graphicData uri="http://schemas.openxmlformats.org/drawingml/2006/picture">
-                <pic:pic xmlns:pic="http://schemas.openxmlformats.org/drawingml/2006/picture">
-                  <pic:nvPicPr>
-                    <pic:cNvPr id="0" name="img24.png"/>
-                    <pic:cNvPicPr/>
-                  </pic:nvPicPr>
-                  <pic:blipFill>
-                    <a:blip r:embed="rId48" cstate="print"/>
-                    <a:stretch>
-                      <a:fillRect/>
-                    </a:stretch>
-                  </pic:blipFill>
-                  <pic:spPr>
-                    <a:xfrm>
-                      <a:off x="0" y="0"/>
-                      <a:ext cx="2857500" cy="2571750"/>
-                    </a:xfrm>
-                    <a:prstGeom prst="rect">
-                      <a:avLst/>
-                    </a:prstGeom>
-                  </pic:spPr>
-                </pic:pic>
-              </a:graphicData>
-            </a:graphic>
-          </wp:inline>
-        </w:drawing>
       </w:r>
     </w:p>
     <w:p>
@@ -15887,7 +15087,7 @@
         <w:rPr>
           <w:sz w:val="1"/>
         </w:rPr>
-        <w:br w:type="textWrapping" w:clear="all"/>
+        <w:br/>
       </w:r>
       <w:r>
         <w:rPr>
@@ -15950,7 +15150,7 @@
         <w:rPr>
           <w:sz w:val="1"/>
         </w:rPr>
-        <w:br w:type="textWrapping" w:clear="all"/>
+        <w:br/>
       </w:r>
       <w:bookmarkStart w:id="66" w:name="_topic_HelpMenu"/>
       <w:bookmarkEnd w:id="66"/>
@@ -15971,7 +15171,6 @@
           <w:color w:val="4F81BD"/>
           <w:sz w:val="22"/>
         </w:rPr>
-        <w:br w:type="page"/>
       </w:r>
     </w:p>
     <w:p>
@@ -16002,7 +15201,6 @@
           <w:color w:val="4F81BD"/>
           <w:sz w:val="22"/>
         </w:rPr>
-        <w:lastRenderedPageBreak/>
         <w:t>Help Menu</w:t>
       </w:r>
       <w:bookmarkEnd w:id="67"/>
@@ -16039,7 +15237,7 @@
           <w:rFonts w:ascii="Times New Roman" w:eastAsia="Times New Roman" w:hAnsi="Times New Roman" w:cs="Times New Roman"/>
           <w:color w:val="000000"/>
         </w:rPr>
-        <w:t>The </w:t>
+        <w:t xml:space="preserve">The </w:t>
       </w:r>
       <w:r>
         <w:rPr>
@@ -16054,7 +15252,7 @@
           <w:rFonts w:ascii="Times New Roman" w:eastAsia="Times New Roman" w:hAnsi="Times New Roman" w:cs="Times New Roman"/>
           <w:color w:val="000000"/>
         </w:rPr>
-        <w:t> menu provides access to official game information, application details, issue reporting, and this help file. It’s your go-to place when you need documentation or support.</w:t>
+        <w:t xml:space="preserve"> menu provides access to official game information, application details, issue reporting, and this help file. It’s your go-to place when you need documentation or support.</w:t>
       </w:r>
     </w:p>
     <w:p>
@@ -16062,41 +15260,6 @@
         <w:rPr>
           <w:noProof/>
         </w:rPr>
-        <w:drawing>
-          <wp:inline distT="0" distB="0" distL="0" distR="0" wp14:anchorId="7355FBF5" wp14:editId="44AFCDB4">
-            <wp:extent cx="2857500" cy="3400425"/>
-            <wp:effectExtent l="0" t="0" r="0" b="0"/>
-            <wp:docPr id="25" name="Pic 25" title="Help Menu Options"/>
-            <wp:cNvGraphicFramePr>
-              <a:graphicFrameLocks xmlns:a="http://schemas.openxmlformats.org/drawingml/2006/main" noChangeAspect="1"/>
-            </wp:cNvGraphicFramePr>
-            <a:graphic xmlns:a="http://schemas.openxmlformats.org/drawingml/2006/main">
-              <a:graphicData uri="http://schemas.openxmlformats.org/drawingml/2006/picture">
-                <pic:pic xmlns:pic="http://schemas.openxmlformats.org/drawingml/2006/picture">
-                  <pic:nvPicPr>
-                    <pic:cNvPr id="0" name="img25.png"/>
-                    <pic:cNvPicPr/>
-                  </pic:nvPicPr>
-                  <pic:blipFill>
-                    <a:blip r:embed="rId52" cstate="print"/>
-                    <a:stretch>
-                      <a:fillRect/>
-                    </a:stretch>
-                  </pic:blipFill>
-                  <pic:spPr>
-                    <a:xfrm>
-                      <a:off x="0" y="0"/>
-                      <a:ext cx="2857500" cy="3400425"/>
-                    </a:xfrm>
-                    <a:prstGeom prst="rect">
-                      <a:avLst/>
-                    </a:prstGeom>
-                  </pic:spPr>
-                </pic:pic>
-              </a:graphicData>
-            </a:graphic>
-          </wp:inline>
-        </w:drawing>
       </w:r>
     </w:p>
     <w:p>
@@ -16138,7 +15301,7 @@
           <w:rFonts w:ascii="Times New Roman" w:eastAsia="Times New Roman" w:hAnsi="Times New Roman" w:cs="Times New Roman"/>
           <w:color w:val="000000"/>
         </w:rPr>
-        <w:t> Opens the in-game </w:t>
+        <w:t xml:space="preserve"> Opens the in-game </w:t>
       </w:r>
       <w:r>
         <w:rPr>
@@ -16153,7 +15316,7 @@
           <w:rFonts w:ascii="Times New Roman" w:eastAsia="Times New Roman" w:hAnsi="Times New Roman" w:cs="Times New Roman"/>
           <w:color w:val="000000"/>
         </w:rPr>
-        <w:t> page in your system's default browser.</w:t>
+        <w:t xml:space="preserve"> page in your system's default browser.</w:t>
       </w:r>
     </w:p>
     <w:p>
@@ -16176,7 +15339,7 @@
           <w:rFonts w:ascii="Times New Roman" w:eastAsia="Times New Roman" w:hAnsi="Times New Roman" w:cs="Times New Roman"/>
           <w:color w:val="000000"/>
         </w:rPr>
-        <w:t> Opens the in-game "How to play" page in your browser.</w:t>
+        <w:t xml:space="preserve"> Opens the in-game "How to play" page in your browser.</w:t>
       </w:r>
     </w:p>
     <w:p>
@@ -16238,7 +15401,7 @@
           <w:rFonts w:ascii="Times New Roman" w:eastAsia="Times New Roman" w:hAnsi="Times New Roman" w:cs="Times New Roman"/>
           <w:color w:val="000000"/>
         </w:rPr>
-        <w:t> Rolls a short in-app credits screen showing developers, contributors, testers, and special thanks.</w:t>
+        <w:t xml:space="preserve"> Rolls a short in-app credits screen showing developers, contributors, testers, and special thanks.</w:t>
       </w:r>
     </w:p>
     <w:p>
@@ -16272,7 +15435,7 @@
           <w:rFonts w:ascii="Times New Roman" w:eastAsia="Times New Roman" w:hAnsi="Times New Roman" w:cs="Times New Roman"/>
           <w:color w:val="000000"/>
         </w:rPr>
-        <w:t> Opens a link to submit a bug or feature request via GitHub. (See separate help entry for details.)</w:t>
+        <w:t xml:space="preserve"> Opens a link to submit a bug or feature request via GitHub. (See separate help entry for details.)</w:t>
       </w:r>
     </w:p>
     <w:p>
@@ -16296,7 +15459,7 @@
           <w:rFonts w:ascii="Times New Roman" w:eastAsia="Times New Roman" w:hAnsi="Times New Roman" w:cs="Times New Roman"/>
           <w:color w:val="000000"/>
         </w:rPr>
-        <w:t> Opens this Help File (CHM) from within the app. You can also press </w:t>
+        <w:t xml:space="preserve"> Opens this Help File (CHM) from within the app. You can also press </w:t>
       </w:r>
       <w:r>
         <w:rPr>
@@ -16310,7 +15473,7 @@
           <w:rFonts w:ascii="Times New Roman" w:eastAsia="Times New Roman" w:hAnsi="Times New Roman" w:cs="Times New Roman"/>
           <w:color w:val="000000"/>
         </w:rPr>
-        <w:t> at any time to access it.</w:t>
+        <w:t xml:space="preserve"> at any time to access it.</w:t>
       </w:r>
     </w:p>
     <w:p>
@@ -16384,7 +15547,7 @@
         <w:rPr>
           <w:sz w:val="1"/>
         </w:rPr>
-        <w:br w:type="textWrapping" w:clear="all"/>
+        <w:br/>
       </w:r>
       <w:r>
         <w:rPr>
@@ -16446,7 +15609,7 @@
         <w:rPr>
           <w:sz w:val="1"/>
         </w:rPr>
-        <w:br w:type="textWrapping" w:clear="all"/>
+        <w:br/>
       </w:r>
       <w:bookmarkStart w:id="71" w:name="_topic_ReportinganIssue"/>
       <w:bookmarkEnd w:id="71"/>
@@ -16465,7 +15628,6 @@
           <w:color w:val="4F81BD"/>
           <w:sz w:val="22"/>
         </w:rPr>
-        <w:br w:type="page"/>
       </w:r>
     </w:p>
     <w:p>
@@ -16493,7 +15655,6 @@
           <w:color w:val="4F81BD"/>
           <w:sz w:val="22"/>
         </w:rPr>
-        <w:lastRenderedPageBreak/>
         <w:t>Reporting an Issue</w:t>
       </w:r>
     </w:p>
@@ -16587,7 +15748,7 @@
           <w:rFonts w:ascii="Times New Roman" w:eastAsia="Times New Roman" w:hAnsi="Times New Roman" w:cs="Times New Roman"/>
           <w:color w:val="000000"/>
         </w:rPr>
-        <w:t> or by clicking "Report an Issue" under the </w:t>
+        <w:t xml:space="preserve"> or by clicking "Report an Issue" under the </w:t>
       </w:r>
       <w:hyperlink r:id="rId55">
         <w:r>
@@ -16662,7 +15823,7 @@
           <w:rFonts w:ascii="Times New Roman" w:eastAsia="Times New Roman" w:hAnsi="Times New Roman" w:cs="Times New Roman"/>
           <w:color w:val="000000"/>
         </w:rPr>
-        <w:t> – Found at: </w:t>
+        <w:t xml:space="preserve"> – Found at: </w:t>
       </w:r>
       <w:hyperlink r:id="rId56">
         <w:r>
@@ -16713,7 +15874,7 @@
           <w:rFonts w:ascii="Times New Roman" w:eastAsia="Times New Roman" w:hAnsi="Times New Roman" w:cs="Times New Roman"/>
           <w:color w:val="000000"/>
         </w:rPr>
-        <w:t> if the issue is visual or UI-related.</w:t>
+        <w:t xml:space="preserve"> if the issue is visual or UI-related.</w:t>
       </w:r>
     </w:p>
     <w:p>
@@ -17212,7 +16373,7 @@
         <w:rPr>
           <w:sz w:val="1"/>
         </w:rPr>
-        <w:br w:type="textWrapping" w:clear="all"/>
+        <w:br/>
       </w:r>
       <w:r>
         <w:rPr>
@@ -17293,7 +16454,7 @@
         <w:rPr>
           <w:sz w:val="1"/>
         </w:rPr>
-        <w:br w:type="textWrapping" w:clear="all"/>
+        <w:br/>
       </w:r>
       <w:bookmarkStart w:id="75" w:name="_topic_MinimapandInformationBars"/>
       <w:bookmarkEnd w:id="75"/>
@@ -17314,7 +16475,6 @@
           <w:color w:val="4F81BD"/>
           <w:sz w:val="26"/>
         </w:rPr>
-        <w:br w:type="page"/>
       </w:r>
     </w:p>
     <w:p>
@@ -17346,7 +16506,6 @@
           <w:color w:val="4F81BD"/>
           <w:sz w:val="26"/>
         </w:rPr>
-        <w:lastRenderedPageBreak/>
         <w:t>Minimap</w:t>
       </w:r>
       <w:proofErr w:type="spellEnd"/>
@@ -17536,7 +16695,7 @@
           <w:rFonts w:ascii="Times New Roman" w:eastAsia="Times New Roman" w:hAnsi="Times New Roman" w:cs="Times New Roman"/>
           <w:color w:val="000000"/>
         </w:rPr>
-        <w:t> – Overview of zoom controls, the recenter and refresh buttons, and the Discord / Website access shortcuts.</w:t>
+        <w:t xml:space="preserve"> – Overview of zoom controls, the recenter and refresh buttons, and the Discord / Website access shortcuts.</w:t>
       </w:r>
     </w:p>
     <w:p>
@@ -17571,7 +16730,7 @@
           <w:rFonts w:ascii="Times New Roman" w:eastAsia="Times New Roman" w:hAnsi="Times New Roman" w:cs="Times New Roman"/>
           <w:color w:val="000000"/>
         </w:rPr>
-        <w:t> – Explains tile-clicking, dropdown routing, and how the map recenters on movement.</w:t>
+        <w:t xml:space="preserve"> – Explains tile-clicking, dropdown routing, and how the map recenters on movement.</w:t>
       </w:r>
     </w:p>
     <w:p>
@@ -17596,7 +16755,7 @@
           <w:rFonts w:ascii="Times New Roman" w:eastAsia="Times New Roman" w:hAnsi="Times New Roman" w:cs="Times New Roman"/>
           <w:color w:val="000000"/>
         </w:rPr>
-        <w:t> – How to set destinations using dropdowns or custom street intersections.</w:t>
+        <w:t xml:space="preserve"> – How to set destinations using dropdowns or custom street intersections.</w:t>
       </w:r>
     </w:p>
     <w:p>
@@ -17663,7 +16822,7 @@
           <w:rFonts w:ascii="Times New Roman" w:eastAsia="Times New Roman" w:hAnsi="Times New Roman" w:cs="Times New Roman"/>
           <w:color w:val="000000"/>
         </w:rPr>
-        <w:t> – Visualizes travel paths using color-coded lines for direct and transit-based routes.</w:t>
+        <w:t xml:space="preserve"> – Visualizes travel paths using color-coded lines for direct and transit-based routes.</w:t>
       </w:r>
     </w:p>
     <w:p>
@@ -17719,7 +16878,7 @@
         <w:rPr>
           <w:sz w:val="1"/>
         </w:rPr>
-        <w:br w:type="textWrapping" w:clear="all"/>
+        <w:br/>
       </w:r>
       <w:r>
         <w:rPr>
@@ -17818,7 +16977,7 @@
         <w:rPr>
           <w:sz w:val="1"/>
         </w:rPr>
-        <w:br w:type="textWrapping" w:clear="all"/>
+        <w:br/>
       </w:r>
       <w:bookmarkStart w:id="79" w:name="_topic_MinimapControls"/>
       <w:bookmarkEnd w:id="79"/>
@@ -17839,7 +16998,6 @@
           <w:color w:val="4F81BD"/>
           <w:sz w:val="22"/>
         </w:rPr>
-        <w:br w:type="page"/>
       </w:r>
     </w:p>
     <w:p>
@@ -17871,7 +17029,6 @@
           <w:color w:val="4F81BD"/>
           <w:sz w:val="22"/>
         </w:rPr>
-        <w:lastRenderedPageBreak/>
         <w:t>Minimap</w:t>
       </w:r>
       <w:proofErr w:type="spellEnd"/>
@@ -17951,41 +17108,6 @@
         <w:rPr>
           <w:noProof/>
         </w:rPr>
-        <w:drawing>
-          <wp:inline distT="0" distB="0" distL="0" distR="0" wp14:anchorId="27735B38" wp14:editId="0F7F2B3E">
-            <wp:extent cx="4762500" cy="2133600"/>
-            <wp:effectExtent l="0" t="0" r="0" b="0"/>
-            <wp:docPr id="26" name="Pic 26" title="Minimap Controls UI"/>
-            <wp:cNvGraphicFramePr>
-              <a:graphicFrameLocks xmlns:a="http://schemas.openxmlformats.org/drawingml/2006/main" noChangeAspect="1"/>
-            </wp:cNvGraphicFramePr>
-            <a:graphic xmlns:a="http://schemas.openxmlformats.org/drawingml/2006/main">
-              <a:graphicData uri="http://schemas.openxmlformats.org/drawingml/2006/picture">
-                <pic:pic xmlns:pic="http://schemas.openxmlformats.org/drawingml/2006/picture">
-                  <pic:nvPicPr>
-                    <pic:cNvPr id="0" name="img26.png"/>
-                    <pic:cNvPicPr/>
-                  </pic:nvPicPr>
-                  <pic:blipFill>
-                    <a:blip r:embed="rId59" cstate="print"/>
-                    <a:stretch>
-                      <a:fillRect/>
-                    </a:stretch>
-                  </pic:blipFill>
-                  <pic:spPr>
-                    <a:xfrm>
-                      <a:off x="0" y="0"/>
-                      <a:ext cx="4762500" cy="2133600"/>
-                    </a:xfrm>
-                    <a:prstGeom prst="rect">
-                      <a:avLst/>
-                    </a:prstGeom>
-                  </pic:spPr>
-                </pic:pic>
-              </a:graphicData>
-            </a:graphic>
-          </wp:inline>
-        </w:drawing>
       </w:r>
     </w:p>
     <w:p>
@@ -18179,7 +17301,7 @@
           <w:rFonts w:ascii="Times New Roman" w:eastAsia="Times New Roman" w:hAnsi="Times New Roman" w:cs="Times New Roman"/>
           <w:color w:val="000000"/>
         </w:rPr>
-        <w:t> Opens the </w:t>
+        <w:t xml:space="preserve"> Opens the </w:t>
       </w:r>
       <w:hyperlink w:anchor="_topic_SetDestinationDialog">
         <w:r>
@@ -18196,7 +17318,7 @@
           <w:rFonts w:ascii="Times New Roman" w:eastAsia="Times New Roman" w:hAnsi="Times New Roman" w:cs="Times New Roman"/>
           <w:color w:val="000000"/>
         </w:rPr>
-        <w:t> to choose a coordinate or location name as your routing target.</w:t>
+        <w:t xml:space="preserve"> to choose a coordinate or location name as your routing target.</w:t>
       </w:r>
     </w:p>
     <w:p>
@@ -18238,7 +17360,7 @@
           <w:rFonts w:ascii="Times New Roman" w:eastAsia="Times New Roman" w:hAnsi="Times New Roman" w:cs="Times New Roman"/>
           <w:color w:val="000000"/>
         </w:rPr>
-        <w:t> Opens the in-app Discord Server List window, showing official and community-run RBC servers. Clicking a server opens its invite link in your browser.</w:t>
+        <w:t xml:space="preserve"> Opens the in-app Discord Server List window, showing official and community-run RBC servers. Clicking a server opens its invite link in your browser.</w:t>
       </w:r>
     </w:p>
     <w:p>
@@ -18334,7 +17456,7 @@
         <w:rPr>
           <w:sz w:val="1"/>
         </w:rPr>
-        <w:br w:type="textWrapping" w:clear="all"/>
+        <w:br/>
       </w:r>
       <w:r>
         <w:rPr>
@@ -18397,7 +17519,7 @@
         <w:rPr>
           <w:sz w:val="1"/>
         </w:rPr>
-        <w:br w:type="textWrapping" w:clear="all"/>
+        <w:br/>
       </w:r>
       <w:bookmarkStart w:id="84" w:name="_topic_NavigatingtheMinimap"/>
       <w:bookmarkEnd w:id="84"/>
@@ -18418,7 +17540,6 @@
           <w:color w:val="4F81BD"/>
           <w:sz w:val="22"/>
         </w:rPr>
-        <w:br w:type="page"/>
       </w:r>
     </w:p>
     <w:p>
@@ -18449,7 +17570,6 @@
           <w:color w:val="4F81BD"/>
           <w:sz w:val="22"/>
         </w:rPr>
-        <w:lastRenderedPageBreak/>
         <w:t xml:space="preserve">Navigating the </w:t>
       </w:r>
       <w:proofErr w:type="spellStart"/>
@@ -18546,41 +17666,6 @@
         <w:rPr>
           <w:noProof/>
         </w:rPr>
-        <w:drawing>
-          <wp:inline distT="0" distB="0" distL="0" distR="0" wp14:anchorId="1CAAB055" wp14:editId="5B3B794E">
-            <wp:extent cx="2857500" cy="2819400"/>
-            <wp:effectExtent l="0" t="0" r="0" b="0"/>
-            <wp:docPr id="27" name="Pic 27" title="Minimap shown at 3x3 zoom level"/>
-            <wp:cNvGraphicFramePr>
-              <a:graphicFrameLocks xmlns:a="http://schemas.openxmlformats.org/drawingml/2006/main" noChangeAspect="1"/>
-            </wp:cNvGraphicFramePr>
-            <a:graphic xmlns:a="http://schemas.openxmlformats.org/drawingml/2006/main">
-              <a:graphicData uri="http://schemas.openxmlformats.org/drawingml/2006/picture">
-                <pic:pic xmlns:pic="http://schemas.openxmlformats.org/drawingml/2006/picture">
-                  <pic:nvPicPr>
-                    <pic:cNvPr id="0" name="img27.png"/>
-                    <pic:cNvPicPr/>
-                  </pic:nvPicPr>
-                  <pic:blipFill>
-                    <a:blip r:embed="rId61" cstate="print"/>
-                    <a:stretch>
-                      <a:fillRect/>
-                    </a:stretch>
-                  </pic:blipFill>
-                  <pic:spPr>
-                    <a:xfrm>
-                      <a:off x="0" y="0"/>
-                      <a:ext cx="2857500" cy="2819400"/>
-                    </a:xfrm>
-                    <a:prstGeom prst="rect">
-                      <a:avLst/>
-                    </a:prstGeom>
-                  </pic:spPr>
-                </pic:pic>
-              </a:graphicData>
-            </a:graphic>
-          </wp:inline>
-        </w:drawing>
       </w:r>
     </w:p>
     <w:p>
@@ -18863,7 +17948,7 @@
           <w:rFonts w:ascii="Times New Roman" w:eastAsia="Times New Roman" w:hAnsi="Times New Roman" w:cs="Times New Roman"/>
           <w:color w:val="000000"/>
         </w:rPr>
-        <w:t>Green and Purple: These show the route selected in the </w:t>
+        <w:t xml:space="preserve">Green and Purple: These show the route selected in the </w:t>
       </w:r>
       <w:hyperlink w:anchor="_topic_CompassRoutes">
         <w:r>
@@ -18919,7 +18004,7 @@
         <w:rPr>
           <w:sz w:val="1"/>
         </w:rPr>
-        <w:br w:type="textWrapping" w:clear="all"/>
+        <w:br/>
       </w:r>
       <w:r>
         <w:rPr>
@@ -18981,7 +18066,7 @@
         <w:rPr>
           <w:sz w:val="1"/>
         </w:rPr>
-        <w:br w:type="textWrapping" w:clear="all"/>
+        <w:br/>
       </w:r>
       <w:bookmarkStart w:id="90" w:name="_topic_CompassRoutes"/>
       <w:bookmarkEnd w:id="90"/>
@@ -19000,7 +18085,6 @@
           <w:color w:val="4F81BD"/>
           <w:sz w:val="22"/>
         </w:rPr>
-        <w:br w:type="page"/>
       </w:r>
     </w:p>
     <w:p>
@@ -19028,7 +18112,6 @@
           <w:color w:val="4F81BD"/>
           <w:sz w:val="22"/>
         </w:rPr>
-        <w:lastRenderedPageBreak/>
         <w:t>Compass Routes</w:t>
       </w:r>
     </w:p>
@@ -19064,7 +18147,7 @@
           <w:rFonts w:ascii="Times New Roman" w:eastAsia="Times New Roman" w:hAnsi="Times New Roman" w:cs="Times New Roman"/>
           <w:color w:val="000000"/>
         </w:rPr>
-        <w:t>The </w:t>
+        <w:t xml:space="preserve">The </w:t>
       </w:r>
       <w:r>
         <w:rPr>
@@ -19106,41 +18189,6 @@
         <w:rPr>
           <w:noProof/>
         </w:rPr>
-        <w:drawing>
-          <wp:inline distT="0" distB="0" distL="0" distR="0" wp14:anchorId="13A989AB" wp14:editId="6A1320E9">
-            <wp:extent cx="1924050" cy="1733550"/>
-            <wp:effectExtent l="0" t="0" r="0" b="0"/>
-            <wp:docPr id="28" name="Pic 28" title="Compass Routes Dialog"/>
-            <wp:cNvGraphicFramePr>
-              <a:graphicFrameLocks xmlns:a="http://schemas.openxmlformats.org/drawingml/2006/main" noChangeAspect="1"/>
-            </wp:cNvGraphicFramePr>
-            <a:graphic xmlns:a="http://schemas.openxmlformats.org/drawingml/2006/main">
-              <a:graphicData uri="http://schemas.openxmlformats.org/drawingml/2006/picture">
-                <pic:pic xmlns:pic="http://schemas.openxmlformats.org/drawingml/2006/picture">
-                  <pic:nvPicPr>
-                    <pic:cNvPr id="0" name="img28.png"/>
-                    <pic:cNvPicPr/>
-                  </pic:nvPicPr>
-                  <pic:blipFill>
-                    <a:blip r:embed="rId63" cstate="print"/>
-                    <a:stretch>
-                      <a:fillRect/>
-                    </a:stretch>
-                  </pic:blipFill>
-                  <pic:spPr>
-                    <a:xfrm>
-                      <a:off x="0" y="0"/>
-                      <a:ext cx="1924050" cy="1733550"/>
-                    </a:xfrm>
-                    <a:prstGeom prst="rect">
-                      <a:avLst/>
-                    </a:prstGeom>
-                  </pic:spPr>
-                </pic:pic>
-              </a:graphicData>
-            </a:graphic>
-          </wp:inline>
-        </w:drawing>
       </w:r>
     </w:p>
     <w:p>
@@ -19156,7 +18204,7 @@
           <w:rFonts w:ascii="Times New Roman" w:eastAsia="Times New Roman" w:hAnsi="Times New Roman" w:cs="Times New Roman"/>
           <w:color w:val="000000"/>
         </w:rPr>
-        <w:t>You can open the </w:t>
+        <w:t xml:space="preserve">You can open the </w:t>
       </w:r>
       <w:r>
         <w:rPr>
@@ -19171,7 +18219,7 @@
           <w:rFonts w:ascii="Times New Roman" w:eastAsia="Times New Roman" w:hAnsi="Times New Roman" w:cs="Times New Roman"/>
           <w:color w:val="000000"/>
         </w:rPr>
-        <w:t> dialog by clicking the </w:t>
+        <w:t xml:space="preserve"> dialog by clicking the </w:t>
       </w:r>
       <w:r>
         <w:rPr>
@@ -19186,7 +18234,7 @@
           <w:rFonts w:ascii="Times New Roman" w:eastAsia="Times New Roman" w:hAnsi="Times New Roman" w:cs="Times New Roman"/>
           <w:color w:val="000000"/>
         </w:rPr>
-        <w:t> icon on the route label at the top of the map.</w:t>
+        <w:t xml:space="preserve"> icon on the route label at the top of the map.</w:t>
       </w:r>
     </w:p>
     <w:p>
@@ -19197,41 +18245,6 @@
         <w:rPr>
           <w:noProof/>
         </w:rPr>
-        <w:drawing>
-          <wp:inline distT="0" distB="0" distL="0" distR="0" wp14:anchorId="7AE288E5" wp14:editId="5FAABBDD">
-            <wp:extent cx="3562350" cy="361950"/>
-            <wp:effectExtent l="0" t="0" r="0" b="0"/>
-            <wp:docPr id="29" name="Pic 29" title="Route Label"/>
-            <wp:cNvGraphicFramePr>
-              <a:graphicFrameLocks xmlns:a="http://schemas.openxmlformats.org/drawingml/2006/main" noChangeAspect="1"/>
-            </wp:cNvGraphicFramePr>
-            <a:graphic xmlns:a="http://schemas.openxmlformats.org/drawingml/2006/main">
-              <a:graphicData uri="http://schemas.openxmlformats.org/drawingml/2006/picture">
-                <pic:pic xmlns:pic="http://schemas.openxmlformats.org/drawingml/2006/picture">
-                  <pic:nvPicPr>
-                    <pic:cNvPr id="0" name="img29.png"/>
-                    <pic:cNvPicPr/>
-                  </pic:nvPicPr>
-                  <pic:blipFill>
-                    <a:blip r:embed="rId64" cstate="print"/>
-                    <a:stretch>
-                      <a:fillRect/>
-                    </a:stretch>
-                  </pic:blipFill>
-                  <pic:spPr>
-                    <a:xfrm>
-                      <a:off x="0" y="0"/>
-                      <a:ext cx="3562350" cy="361950"/>
-                    </a:xfrm>
-                    <a:prstGeom prst="rect">
-                      <a:avLst/>
-                    </a:prstGeom>
-                  </pic:spPr>
-                </pic:pic>
-              </a:graphicData>
-            </a:graphic>
-          </wp:inline>
-        </w:drawing>
       </w:r>
     </w:p>
     <w:p>
@@ -19266,7 +18279,7 @@
           <w:rFonts w:ascii="Times New Roman" w:eastAsia="Times New Roman" w:hAnsi="Times New Roman" w:cs="Times New Roman"/>
           <w:color w:val="000000"/>
         </w:rPr>
-        <w:t>The </w:t>
+        <w:t xml:space="preserve">The </w:t>
       </w:r>
       <w:r>
         <w:rPr>
@@ -19281,7 +18294,7 @@
           <w:rFonts w:ascii="Times New Roman" w:eastAsia="Times New Roman" w:hAnsi="Times New Roman" w:cs="Times New Roman"/>
           <w:color w:val="000000"/>
         </w:rPr>
-        <w:t> represents the shortest walking route between your current location and your selected destination.</w:t>
+        <w:t xml:space="preserve"> represents the shortest walking route between your current location and your selected destination.</w:t>
       </w:r>
     </w:p>
     <w:p>
@@ -19289,41 +18302,6 @@
         <w:rPr>
           <w:noProof/>
         </w:rPr>
-        <w:drawing>
-          <wp:inline distT="0" distB="0" distL="0" distR="0" wp14:anchorId="33F60519" wp14:editId="002E5492">
-            <wp:extent cx="2857500" cy="2714625"/>
-            <wp:effectExtent l="0" t="0" r="0" b="0"/>
-            <wp:docPr id="30" name="Pic 30" title="Minimap showing direct walking route"/>
-            <wp:cNvGraphicFramePr>
-              <a:graphicFrameLocks xmlns:a="http://schemas.openxmlformats.org/drawingml/2006/main" noChangeAspect="1"/>
-            </wp:cNvGraphicFramePr>
-            <a:graphic xmlns:a="http://schemas.openxmlformats.org/drawingml/2006/main">
-              <a:graphicData uri="http://schemas.openxmlformats.org/drawingml/2006/picture">
-                <pic:pic xmlns:pic="http://schemas.openxmlformats.org/drawingml/2006/picture">
-                  <pic:nvPicPr>
-                    <pic:cNvPr id="0" name="img30.png"/>
-                    <pic:cNvPicPr/>
-                  </pic:nvPicPr>
-                  <pic:blipFill>
-                    <a:blip r:embed="rId65" cstate="print"/>
-                    <a:stretch>
-                      <a:fillRect/>
-                    </a:stretch>
-                  </pic:blipFill>
-                  <pic:spPr>
-                    <a:xfrm>
-                      <a:off x="0" y="0"/>
-                      <a:ext cx="2857500" cy="2714625"/>
-                    </a:xfrm>
-                    <a:prstGeom prst="rect">
-                      <a:avLst/>
-                    </a:prstGeom>
-                  </pic:spPr>
-                </pic:pic>
-              </a:graphicData>
-            </a:graphic>
-          </wp:inline>
-        </w:drawing>
       </w:r>
     </w:p>
     <w:p>
@@ -19389,7 +18367,7 @@
           <w:rFonts w:ascii="Times New Roman" w:eastAsia="Times New Roman" w:hAnsi="Times New Roman" w:cs="Times New Roman"/>
           <w:color w:val="000000"/>
         </w:rPr>
-        <w:t>The </w:t>
+        <w:t xml:space="preserve">The </w:t>
       </w:r>
       <w:r>
         <w:rPr>
@@ -19404,7 +18382,7 @@
           <w:rFonts w:ascii="Times New Roman" w:eastAsia="Times New Roman" w:hAnsi="Times New Roman" w:cs="Times New Roman"/>
           <w:color w:val="000000"/>
         </w:rPr>
-        <w:t> represents the most efficient known route that includes transit options such as rail or bus.</w:t>
+        <w:t xml:space="preserve"> represents the most efficient known route that includes transit options such as rail or bus.</w:t>
       </w:r>
     </w:p>
     <w:p>
@@ -19412,42 +18390,6 @@
         <w:rPr>
           <w:noProof/>
         </w:rPr>
-        <w:lastRenderedPageBreak/>
-        <w:drawing>
-          <wp:inline distT="0" distB="0" distL="0" distR="0" wp14:anchorId="0C6F1944" wp14:editId="1D291056">
-            <wp:extent cx="2857500" cy="2828925"/>
-            <wp:effectExtent l="0" t="0" r="0" b="0"/>
-            <wp:docPr id="31" name="Pic 31" title="Minimap showing route using transit"/>
-            <wp:cNvGraphicFramePr>
-              <a:graphicFrameLocks xmlns:a="http://schemas.openxmlformats.org/drawingml/2006/main" noChangeAspect="1"/>
-            </wp:cNvGraphicFramePr>
-            <a:graphic xmlns:a="http://schemas.openxmlformats.org/drawingml/2006/main">
-              <a:graphicData uri="http://schemas.openxmlformats.org/drawingml/2006/picture">
-                <pic:pic xmlns:pic="http://schemas.openxmlformats.org/drawingml/2006/picture">
-                  <pic:nvPicPr>
-                    <pic:cNvPr id="0" name="img31.png"/>
-                    <pic:cNvPicPr/>
-                  </pic:nvPicPr>
-                  <pic:blipFill>
-                    <a:blip r:embed="rId66" cstate="print"/>
-                    <a:stretch>
-                      <a:fillRect/>
-                    </a:stretch>
-                  </pic:blipFill>
-                  <pic:spPr>
-                    <a:xfrm>
-                      <a:off x="0" y="0"/>
-                      <a:ext cx="2857500" cy="2828925"/>
-                    </a:xfrm>
-                    <a:prstGeom prst="rect">
-                      <a:avLst/>
-                    </a:prstGeom>
-                  </pic:spPr>
-                </pic:pic>
-              </a:graphicData>
-            </a:graphic>
-          </wp:inline>
-        </w:drawing>
       </w:r>
     </w:p>
     <w:p>
@@ -19584,7 +18526,7 @@
         <w:rPr>
           <w:sz w:val="1"/>
         </w:rPr>
-        <w:br w:type="textWrapping" w:clear="all"/>
+        <w:br/>
       </w:r>
       <w:r>
         <w:rPr>
@@ -19657,7 +18599,7 @@
         <w:rPr>
           <w:sz w:val="1"/>
         </w:rPr>
-        <w:br w:type="textWrapping" w:clear="all"/>
+        <w:br/>
       </w:r>
       <w:bookmarkStart w:id="95" w:name="_topic_SetDestinationDialog"/>
       <w:bookmarkEnd w:id="95"/>
@@ -19678,7 +18620,6 @@
           <w:color w:val="4F81BD"/>
           <w:sz w:val="22"/>
         </w:rPr>
-        <w:br w:type="page"/>
       </w:r>
     </w:p>
     <w:p>
@@ -19709,7 +18650,6 @@
           <w:color w:val="4F81BD"/>
           <w:sz w:val="22"/>
         </w:rPr>
-        <w:lastRenderedPageBreak/>
         <w:t>Set Destination Dialog</w:t>
       </w:r>
       <w:bookmarkEnd w:id="96"/>
@@ -19746,7 +18686,7 @@
           <w:rFonts w:ascii="Times New Roman" w:eastAsia="Times New Roman" w:hAnsi="Times New Roman" w:cs="Times New Roman"/>
           <w:color w:val="000000"/>
         </w:rPr>
-        <w:t>The </w:t>
+        <w:t xml:space="preserve">The </w:t>
       </w:r>
       <w:r>
         <w:rPr>
@@ -19761,7 +18701,7 @@
           <w:rFonts w:ascii="Times New Roman" w:eastAsia="Times New Roman" w:hAnsi="Times New Roman" w:cs="Times New Roman"/>
           <w:color w:val="000000"/>
         </w:rPr>
-        <w:t> dialog provides a detailed interface for choosing where to route your vampire. You can select a known location from categorized dropdowns or manually define a custom destination using city street coordinates.</w:t>
+        <w:t xml:space="preserve"> dialog provides a detailed interface for choosing where to route your vampire. You can select a known location from categorized dropdowns or manually define a custom destination using city street coordinates.</w:t>
       </w:r>
     </w:p>
     <w:p>
@@ -19769,41 +18709,6 @@
         <w:rPr>
           <w:noProof/>
         </w:rPr>
-        <w:drawing>
-          <wp:inline distT="0" distB="0" distL="0" distR="0" wp14:anchorId="4B6471CC" wp14:editId="676E8366">
-            <wp:extent cx="4762500" cy="3286125"/>
-            <wp:effectExtent l="0" t="0" r="0" b="0"/>
-            <wp:docPr id="32" name="Pic 32" title="Set Destination Dialog"/>
-            <wp:cNvGraphicFramePr>
-              <a:graphicFrameLocks xmlns:a="http://schemas.openxmlformats.org/drawingml/2006/main" noChangeAspect="1"/>
-            </wp:cNvGraphicFramePr>
-            <a:graphic xmlns:a="http://schemas.openxmlformats.org/drawingml/2006/main">
-              <a:graphicData uri="http://schemas.openxmlformats.org/drawingml/2006/picture">
-                <pic:pic xmlns:pic="http://schemas.openxmlformats.org/drawingml/2006/picture">
-                  <pic:nvPicPr>
-                    <pic:cNvPr id="0" name="img32.png"/>
-                    <pic:cNvPicPr/>
-                  </pic:nvPicPr>
-                  <pic:blipFill>
-                    <a:blip r:embed="rId68" cstate="print"/>
-                    <a:stretch>
-                      <a:fillRect/>
-                    </a:stretch>
-                  </pic:blipFill>
-                  <pic:spPr>
-                    <a:xfrm>
-                      <a:off x="0" y="0"/>
-                      <a:ext cx="4762500" cy="3286125"/>
-                    </a:xfrm>
-                    <a:prstGeom prst="rect">
-                      <a:avLst/>
-                    </a:prstGeom>
-                  </pic:spPr>
-                </pic:pic>
-              </a:graphicData>
-            </a:graphic>
-          </wp:inline>
-        </w:drawing>
       </w:r>
     </w:p>
     <w:p>
@@ -19902,7 +18807,7 @@
           <w:rFonts w:ascii="Times New Roman" w:eastAsia="Times New Roman" w:hAnsi="Times New Roman" w:cs="Times New Roman"/>
           <w:color w:val="000000"/>
         </w:rPr>
-        <w:t> A list of all known taverns.</w:t>
+        <w:t xml:space="preserve"> A list of all known taverns.</w:t>
       </w:r>
     </w:p>
     <w:p>
@@ -19925,7 +18830,7 @@
           <w:rFonts w:ascii="Times New Roman" w:eastAsia="Times New Roman" w:hAnsi="Times New Roman" w:cs="Times New Roman"/>
           <w:color w:val="000000"/>
         </w:rPr>
-        <w:t> A list of all known bank locations.</w:t>
+        <w:t xml:space="preserve"> A list of all known bank locations.</w:t>
       </w:r>
     </w:p>
     <w:p>
@@ -19948,7 +18853,7 @@
           <w:rFonts w:ascii="Times New Roman" w:eastAsia="Times New Roman" w:hAnsi="Times New Roman" w:cs="Times New Roman"/>
           <w:color w:val="000000"/>
         </w:rPr>
-        <w:t> All known transit station locations.</w:t>
+        <w:t xml:space="preserve"> All known transit station locations.</w:t>
       </w:r>
     </w:p>
     <w:p>
@@ -19971,7 +18876,7 @@
           <w:rFonts w:ascii="Times New Roman" w:eastAsia="Times New Roman" w:hAnsi="Times New Roman" w:cs="Times New Roman"/>
           <w:color w:val="000000"/>
         </w:rPr>
-        <w:t> All known shops recorded in your local database.</w:t>
+        <w:t xml:space="preserve"> All known shops recorded in your local database.</w:t>
       </w:r>
     </w:p>
     <w:p>
@@ -19994,7 +18899,7 @@
           <w:rFonts w:ascii="Times New Roman" w:eastAsia="Times New Roman" w:hAnsi="Times New Roman" w:cs="Times New Roman"/>
           <w:color w:val="000000"/>
         </w:rPr>
-        <w:t> All known guilds recorded in your local database.</w:t>
+        <w:t xml:space="preserve"> All known guilds recorded in your local database.</w:t>
       </w:r>
     </w:p>
     <w:p>
@@ -20017,7 +18922,7 @@
           <w:rFonts w:ascii="Times New Roman" w:eastAsia="Times New Roman" w:hAnsi="Times New Roman" w:cs="Times New Roman"/>
           <w:color w:val="000000"/>
         </w:rPr>
-        <w:t> Includes special locations like the Graveyard, Hall of Binding, Hall of Severance, and unique or one-off locations that don’t fit elsewhere.</w:t>
+        <w:t xml:space="preserve"> Includes special locations like the Graveyard, Hall of Binding, Hall of Severance, and unique or one-off locations that don’t fit elsewhere.</w:t>
       </w:r>
     </w:p>
     <w:p>
@@ -20041,7 +18946,7 @@
           <w:rFonts w:ascii="Times New Roman" w:eastAsia="Times New Roman" w:hAnsi="Times New Roman" w:cs="Times New Roman"/>
           <w:color w:val="000000"/>
         </w:rPr>
-        <w:t> A list of all known player-owned locations.</w:t>
+        <w:t xml:space="preserve"> A list of all known player-owned locations.</w:t>
       </w:r>
     </w:p>
     <w:p>
@@ -20131,7 +19036,7 @@
           <w:rFonts w:ascii="Times New Roman" w:eastAsia="Times New Roman" w:hAnsi="Times New Roman" w:cs="Times New Roman"/>
           <w:color w:val="000000"/>
         </w:rPr>
-        <w:t> </w:t>
+        <w:t xml:space="preserve"> </w:t>
       </w:r>
       <w:proofErr w:type="gramStart"/>
       <w:r>
@@ -20170,7 +19075,7 @@
           <w:rFonts w:ascii="Times New Roman" w:eastAsia="Times New Roman" w:hAnsi="Times New Roman" w:cs="Times New Roman"/>
           <w:color w:val="000000"/>
         </w:rPr>
-        <w:t> Position relative to the intersection:</w:t>
+        <w:t xml:space="preserve"> Position relative to the intersection:</w:t>
       </w:r>
     </w:p>
     <w:p>
@@ -20193,7 +19098,7 @@
           <w:rFonts w:ascii="Times New Roman" w:eastAsia="Times New Roman" w:hAnsi="Times New Roman" w:cs="Times New Roman"/>
           <w:color w:val="000000"/>
         </w:rPr>
-        <w:t> At the intersection</w:t>
+        <w:t xml:space="preserve"> At the intersection</w:t>
       </w:r>
     </w:p>
     <w:p>
@@ -20235,7 +19140,7 @@
           <w:rFonts w:ascii="Times New Roman" w:eastAsia="Times New Roman" w:hAnsi="Times New Roman" w:cs="Times New Roman"/>
           <w:color w:val="000000"/>
         </w:rPr>
-        <w:t> One cell away from the intersection in that direction</w:t>
+        <w:t xml:space="preserve"> One cell away from the intersection in that direction</w:t>
       </w:r>
     </w:p>
     <w:p>
@@ -20253,7 +19158,6 @@
           <w:rFonts w:ascii="Times New Roman" w:eastAsia="Times New Roman" w:hAnsi="Times New Roman" w:cs="Times New Roman"/>
           <w:color w:val="000000"/>
         </w:rPr>
-        <w:lastRenderedPageBreak/>
         <w:t>Buttons:</w:t>
       </w:r>
       <w:bookmarkEnd w:id="100"/>
@@ -20317,7 +19221,7 @@
           <w:rFonts w:ascii="Times New Roman" w:eastAsia="Times New Roman" w:hAnsi="Times New Roman" w:cs="Times New Roman"/>
           <w:color w:val="000000"/>
         </w:rPr>
-        <w:t> Removes the current destination.</w:t>
+        <w:t xml:space="preserve"> Removes the current destination.</w:t>
       </w:r>
     </w:p>
     <w:p>
@@ -20340,7 +19244,7 @@
           <w:rFonts w:ascii="Times New Roman" w:eastAsia="Times New Roman" w:hAnsi="Times New Roman" w:cs="Times New Roman"/>
           <w:color w:val="000000"/>
         </w:rPr>
-        <w:t> Updates shop and guild data from A View in the Dark (AVITD).</w:t>
+        <w:t xml:space="preserve"> Updates shop and guild data from A View in the Dark (AVITD).</w:t>
       </w:r>
     </w:p>
     <w:p>
@@ -20364,7 +19268,7 @@
           <w:rFonts w:ascii="Times New Roman" w:eastAsia="Times New Roman" w:hAnsi="Times New Roman" w:cs="Times New Roman"/>
           <w:color w:val="000000"/>
         </w:rPr>
-        <w:t> Closes the dialog without applying changes.</w:t>
+        <w:t xml:space="preserve"> Closes the dialog without applying changes.</w:t>
       </w:r>
     </w:p>
     <w:p>
@@ -20404,7 +19308,7 @@
         <w:rPr>
           <w:sz w:val="1"/>
         </w:rPr>
-        <w:br w:type="textWrapping" w:clear="all"/>
+        <w:br/>
       </w:r>
       <w:r>
         <w:rPr>
@@ -20467,7 +19371,7 @@
         <w:rPr>
           <w:sz w:val="1"/>
         </w:rPr>
-        <w:br w:type="textWrapping" w:clear="all"/>
+        <w:br/>
       </w:r>
       <w:bookmarkStart w:id="101" w:name="_topic_InformationBars"/>
       <w:bookmarkEnd w:id="101"/>
@@ -20488,7 +19392,6 @@
           <w:color w:val="4F81BD"/>
           <w:sz w:val="22"/>
         </w:rPr>
-        <w:br w:type="page"/>
       </w:r>
     </w:p>
     <w:p>
@@ -20519,7 +19422,6 @@
           <w:color w:val="4F81BD"/>
           <w:sz w:val="22"/>
         </w:rPr>
-        <w:lastRenderedPageBreak/>
         <w:t>Information Bars</w:t>
       </w:r>
       <w:bookmarkEnd w:id="102"/>
@@ -20599,41 +19501,6 @@
         <w:rPr>
           <w:noProof/>
         </w:rPr>
-        <w:drawing>
-          <wp:inline distT="0" distB="0" distL="0" distR="0" wp14:anchorId="15B3D1F3" wp14:editId="2E8A0E5A">
-            <wp:extent cx="4762500" cy="4419600"/>
-            <wp:effectExtent l="0" t="0" r="0" b="0"/>
-            <wp:docPr id="33" name="Pic 33" title="Information Bars without Destination"/>
-            <wp:cNvGraphicFramePr>
-              <a:graphicFrameLocks xmlns:a="http://schemas.openxmlformats.org/drawingml/2006/main" noChangeAspect="1"/>
-            </wp:cNvGraphicFramePr>
-            <a:graphic xmlns:a="http://schemas.openxmlformats.org/drawingml/2006/main">
-              <a:graphicData uri="http://schemas.openxmlformats.org/drawingml/2006/picture">
-                <pic:pic xmlns:pic="http://schemas.openxmlformats.org/drawingml/2006/picture">
-                  <pic:nvPicPr>
-                    <pic:cNvPr id="0" name="img33.png"/>
-                    <pic:cNvPicPr/>
-                  </pic:nvPicPr>
-                  <pic:blipFill>
-                    <a:blip r:embed="rId70" cstate="print"/>
-                    <a:stretch>
-                      <a:fillRect/>
-                    </a:stretch>
-                  </pic:blipFill>
-                  <pic:spPr>
-                    <a:xfrm>
-                      <a:off x="0" y="0"/>
-                      <a:ext cx="4762500" cy="4419600"/>
-                    </a:xfrm>
-                    <a:prstGeom prst="rect">
-                      <a:avLst/>
-                    </a:prstGeom>
-                  </pic:spPr>
-                </pic:pic>
-              </a:graphicData>
-            </a:graphic>
-          </wp:inline>
-        </w:drawing>
       </w:r>
     </w:p>
     <w:p>
@@ -20656,7 +19523,7 @@
           <w:rFonts w:ascii="Times New Roman" w:eastAsia="Times New Roman" w:hAnsi="Times New Roman" w:cs="Times New Roman"/>
           <w:color w:val="000000"/>
         </w:rPr>
-        <w:t> Nearest </w:t>
+        <w:t xml:space="preserve"> Nearest </w:t>
       </w:r>
       <w:r>
         <w:rPr>
@@ -20671,7 +19538,7 @@
           <w:rFonts w:ascii="Times New Roman" w:eastAsia="Times New Roman" w:hAnsi="Times New Roman" w:cs="Times New Roman"/>
           <w:color w:val="000000"/>
         </w:rPr>
-        <w:t> to your current location.</w:t>
+        <w:t xml:space="preserve"> to your current location.</w:t>
       </w:r>
     </w:p>
     <w:p>
@@ -20694,7 +19561,7 @@
           <w:rFonts w:ascii="Times New Roman" w:eastAsia="Times New Roman" w:hAnsi="Times New Roman" w:cs="Times New Roman"/>
           <w:color w:val="000000"/>
         </w:rPr>
-        <w:t> Nearest </w:t>
+        <w:t xml:space="preserve"> Nearest </w:t>
       </w:r>
       <w:r>
         <w:rPr>
@@ -20709,7 +19576,7 @@
           <w:rFonts w:ascii="Times New Roman" w:eastAsia="Times New Roman" w:hAnsi="Times New Roman" w:cs="Times New Roman"/>
           <w:color w:val="000000"/>
         </w:rPr>
-        <w:t> (rail, bus, etc.).</w:t>
+        <w:t xml:space="preserve"> (rail, bus, etc.).</w:t>
       </w:r>
     </w:p>
     <w:p>
@@ -20733,7 +19600,7 @@
           <w:rFonts w:ascii="Times New Roman" w:eastAsia="Times New Roman" w:hAnsi="Times New Roman" w:cs="Times New Roman"/>
           <w:color w:val="000000"/>
         </w:rPr>
-        <w:t> Nearest </w:t>
+        <w:t xml:space="preserve"> Nearest </w:t>
       </w:r>
       <w:r>
         <w:rPr>
@@ -20766,7 +19633,6 @@
           <w:rFonts w:ascii="Times New Roman" w:eastAsia="Times New Roman" w:hAnsi="Times New Roman" w:cs="Times New Roman"/>
           <w:color w:val="000000"/>
         </w:rPr>
-        <w:lastRenderedPageBreak/>
         <w:t>With a Destination Set:</w:t>
       </w:r>
       <w:bookmarkEnd w:id="105"/>
@@ -20776,41 +19642,6 @@
         <w:rPr>
           <w:noProof/>
         </w:rPr>
-        <w:drawing>
-          <wp:inline distT="0" distB="0" distL="0" distR="0" wp14:anchorId="01555995" wp14:editId="425A5629">
-            <wp:extent cx="4762500" cy="4314825"/>
-            <wp:effectExtent l="0" t="0" r="0" b="0"/>
-            <wp:docPr id="34" name="Pic 34" title="Information Bars with Destination Set"/>
-            <wp:cNvGraphicFramePr>
-              <a:graphicFrameLocks xmlns:a="http://schemas.openxmlformats.org/drawingml/2006/main" noChangeAspect="1"/>
-            </wp:cNvGraphicFramePr>
-            <a:graphic xmlns:a="http://schemas.openxmlformats.org/drawingml/2006/main">
-              <a:graphicData uri="http://schemas.openxmlformats.org/drawingml/2006/picture">
-                <pic:pic xmlns:pic="http://schemas.openxmlformats.org/drawingml/2006/picture">
-                  <pic:nvPicPr>
-                    <pic:cNvPr id="0" name="img34.png"/>
-                    <pic:cNvPicPr/>
-                  </pic:nvPicPr>
-                  <pic:blipFill>
-                    <a:blip r:embed="rId71" cstate="print"/>
-                    <a:stretch>
-                      <a:fillRect/>
-                    </a:stretch>
-                  </pic:blipFill>
-                  <pic:spPr>
-                    <a:xfrm>
-                      <a:off x="0" y="0"/>
-                      <a:ext cx="4762500" cy="4314825"/>
-                    </a:xfrm>
-                    <a:prstGeom prst="rect">
-                      <a:avLst/>
-                    </a:prstGeom>
-                  </pic:spPr>
-                </pic:pic>
-              </a:graphicData>
-            </a:graphic>
-          </wp:inline>
-        </w:drawing>
       </w:r>
     </w:p>
     <w:p>
@@ -20833,7 +19664,7 @@
           <w:rFonts w:ascii="Times New Roman" w:eastAsia="Times New Roman" w:hAnsi="Times New Roman" w:cs="Times New Roman"/>
           <w:color w:val="000000"/>
         </w:rPr>
-        <w:t> AP cost and tile distance to the destination </w:t>
+        <w:t xml:space="preserve"> AP cost and tile distance to the destination </w:t>
       </w:r>
       <w:r>
         <w:rPr>
@@ -20872,7 +19703,7 @@
           <w:rFonts w:ascii="Times New Roman" w:eastAsia="Times New Roman" w:hAnsi="Times New Roman" w:cs="Times New Roman"/>
           <w:color w:val="000000"/>
         </w:rPr>
-        <w:t> AP cost and tile distance </w:t>
+        <w:t xml:space="preserve"> AP cost and tile distance </w:t>
       </w:r>
       <w:r>
         <w:rPr>
@@ -20887,7 +19718,7 @@
           <w:rFonts w:ascii="Times New Roman" w:eastAsia="Times New Roman" w:hAnsi="Times New Roman" w:cs="Times New Roman"/>
           <w:color w:val="000000"/>
         </w:rPr>
-        <w:t> along the route (if more efficient).</w:t>
+        <w:t xml:space="preserve"> along the route (if more efficient).</w:t>
       </w:r>
     </w:p>
     <w:p>
@@ -20962,7 +19793,7 @@
         <w:rPr>
           <w:sz w:val="1"/>
         </w:rPr>
-        <w:br w:type="textWrapping" w:clear="all"/>
+        <w:br/>
       </w:r>
       <w:r>
         <w:rPr>
@@ -21025,7 +19856,7 @@
         <w:rPr>
           <w:sz w:val="1"/>
         </w:rPr>
-        <w:br w:type="textWrapping" w:clear="all"/>
+        <w:br/>
       </w:r>
       <w:bookmarkStart w:id="107" w:name="_topic_CharacterManagement"/>
       <w:bookmarkEnd w:id="107"/>
@@ -21046,7 +19877,6 @@
           <w:color w:val="4F81BD"/>
           <w:sz w:val="26"/>
         </w:rPr>
-        <w:br w:type="page"/>
       </w:r>
     </w:p>
     <w:p>
@@ -21077,7 +19907,6 @@
           <w:color w:val="4F81BD"/>
           <w:sz w:val="26"/>
         </w:rPr>
-        <w:lastRenderedPageBreak/>
         <w:t>Character Management</w:t>
       </w:r>
       <w:bookmarkEnd w:id="108"/>
@@ -21114,7 +19943,7 @@
           <w:rFonts w:ascii="Times New Roman" w:eastAsia="Times New Roman" w:hAnsi="Times New Roman" w:cs="Times New Roman"/>
           <w:color w:val="000000"/>
         </w:rPr>
-        <w:t>The </w:t>
+        <w:t xml:space="preserve">The </w:t>
       </w:r>
       <w:r>
         <w:rPr>
@@ -21153,41 +19982,6 @@
         <w:rPr>
           <w:noProof/>
         </w:rPr>
-        <w:drawing>
-          <wp:inline distT="0" distB="0" distL="0" distR="0" wp14:anchorId="1EA8431B" wp14:editId="38232A71">
-            <wp:extent cx="4286250" cy="3857625"/>
-            <wp:effectExtent l="0" t="0" r="0" b="0"/>
-            <wp:docPr id="35" name="Pic 35" title="Character List Dialog"/>
-            <wp:cNvGraphicFramePr>
-              <a:graphicFrameLocks xmlns:a="http://schemas.openxmlformats.org/drawingml/2006/main" noChangeAspect="1"/>
-            </wp:cNvGraphicFramePr>
-            <a:graphic xmlns:a="http://schemas.openxmlformats.org/drawingml/2006/main">
-              <a:graphicData uri="http://schemas.openxmlformats.org/drawingml/2006/picture">
-                <pic:pic xmlns:pic="http://schemas.openxmlformats.org/drawingml/2006/picture">
-                  <pic:nvPicPr>
-                    <pic:cNvPr id="0" name="img35.png"/>
-                    <pic:cNvPicPr/>
-                  </pic:nvPicPr>
-                  <pic:blipFill>
-                    <a:blip r:embed="rId73" cstate="print"/>
-                    <a:stretch>
-                      <a:fillRect/>
-                    </a:stretch>
-                  </pic:blipFill>
-                  <pic:spPr>
-                    <a:xfrm>
-                      <a:off x="0" y="0"/>
-                      <a:ext cx="4286250" cy="3857625"/>
-                    </a:xfrm>
-                    <a:prstGeom prst="rect">
-                      <a:avLst/>
-                    </a:prstGeom>
-                  </pic:spPr>
-                </pic:pic>
-              </a:graphicData>
-            </a:graphic>
-          </wp:inline>
-        </w:drawing>
       </w:r>
     </w:p>
     <w:p>
@@ -21229,7 +20023,7 @@
           <w:rFonts w:ascii="Times New Roman" w:eastAsia="Times New Roman" w:hAnsi="Times New Roman" w:cs="Times New Roman"/>
           <w:color w:val="000000"/>
         </w:rPr>
-        <w:t> with their names and passwords securely stored in your local database.</w:t>
+        <w:t xml:space="preserve"> with their names and passwords securely stored in your local database.</w:t>
       </w:r>
     </w:p>
     <w:p>
@@ -21252,7 +20046,7 @@
           <w:rFonts w:ascii="Times New Roman" w:eastAsia="Times New Roman" w:hAnsi="Times New Roman" w:cs="Times New Roman"/>
           <w:color w:val="000000"/>
         </w:rPr>
-        <w:t> using stored login cookies for instant login and session recall.</w:t>
+        <w:t xml:space="preserve"> using stored login cookies for instant login and session recall.</w:t>
       </w:r>
     </w:p>
     <w:p>
@@ -21275,7 +20069,7 @@
           <w:rFonts w:ascii="Times New Roman" w:eastAsia="Times New Roman" w:hAnsi="Times New Roman" w:cs="Times New Roman"/>
           <w:color w:val="000000"/>
         </w:rPr>
-        <w:t> if a character is no longer in use.</w:t>
+        <w:t xml:space="preserve"> if a character is no longer in use.</w:t>
       </w:r>
     </w:p>
     <w:p>
@@ -21299,7 +20093,7 @@
           <w:rFonts w:ascii="Times New Roman" w:eastAsia="Times New Roman" w:hAnsi="Times New Roman" w:cs="Times New Roman"/>
           <w:color w:val="000000"/>
         </w:rPr>
-        <w:t> and track which character is currently active.</w:t>
+        <w:t xml:space="preserve"> and track which character is currently active.</w:t>
       </w:r>
     </w:p>
     <w:p>
@@ -21393,7 +20187,7 @@
         <w:rPr>
           <w:sz w:val="1"/>
         </w:rPr>
-        <w:br w:type="textWrapping" w:clear="all"/>
+        <w:br/>
       </w:r>
       <w:r>
         <w:rPr>
@@ -21456,7 +20250,7 @@
         <w:rPr>
           <w:sz w:val="1"/>
         </w:rPr>
-        <w:br w:type="textWrapping" w:clear="all"/>
+        <w:br/>
       </w:r>
       <w:bookmarkStart w:id="112" w:name="_topic_AddModifyDeleteCharacters"/>
       <w:bookmarkEnd w:id="112"/>
@@ -21477,7 +20271,6 @@
           <w:color w:val="4F81BD"/>
           <w:sz w:val="22"/>
         </w:rPr>
-        <w:br w:type="page"/>
       </w:r>
     </w:p>
     <w:p>
@@ -21508,7 +20301,6 @@
           <w:color w:val="4F81BD"/>
           <w:sz w:val="22"/>
         </w:rPr>
-        <w:lastRenderedPageBreak/>
         <w:t>Add, Modify, Delete Characters</w:t>
       </w:r>
       <w:bookmarkEnd w:id="113"/>
@@ -21588,7 +20380,7 @@
           <w:rFonts w:ascii="Times New Roman" w:eastAsia="Times New Roman" w:hAnsi="Times New Roman" w:cs="Times New Roman"/>
           <w:color w:val="000000"/>
         </w:rPr>
-        <w:t>Click the </w:t>
+        <w:t xml:space="preserve">Click the </w:t>
       </w:r>
       <w:r>
         <w:rPr>
@@ -21603,7 +20395,7 @@
           <w:rFonts w:ascii="Times New Roman" w:eastAsia="Times New Roman" w:hAnsi="Times New Roman" w:cs="Times New Roman"/>
           <w:color w:val="000000"/>
         </w:rPr>
-        <w:t> button below the character list.</w:t>
+        <w:t xml:space="preserve"> button below the character list.</w:t>
       </w:r>
     </w:p>
     <w:p>
@@ -21634,7 +20426,7 @@
           <w:rFonts w:ascii="Times New Roman" w:eastAsia="Times New Roman" w:hAnsi="Times New Roman" w:cs="Times New Roman"/>
           <w:color w:val="000000"/>
         </w:rPr>
-        <w:t>Click </w:t>
+        <w:t xml:space="preserve">Click </w:t>
       </w:r>
       <w:r>
         <w:rPr>
@@ -21649,7 +20441,7 @@
           <w:rFonts w:ascii="Times New Roman" w:eastAsia="Times New Roman" w:hAnsi="Times New Roman" w:cs="Times New Roman"/>
           <w:color w:val="000000"/>
         </w:rPr>
-        <w:t> to save. The character will appear in the list.</w:t>
+        <w:t xml:space="preserve"> to save. The character will appear in the list.</w:t>
       </w:r>
     </w:p>
     <w:p>
@@ -21684,7 +20476,7 @@
           <w:rFonts w:ascii="Times New Roman" w:eastAsia="Times New Roman" w:hAnsi="Times New Roman" w:cs="Times New Roman"/>
           <w:color w:val="000000"/>
         </w:rPr>
-        <w:t>The </w:t>
+        <w:t xml:space="preserve">The </w:t>
       </w:r>
       <w:r>
         <w:rPr>
@@ -21699,7 +20491,7 @@
           <w:rFonts w:ascii="Times New Roman" w:eastAsia="Times New Roman" w:hAnsi="Times New Roman" w:cs="Times New Roman"/>
           <w:color w:val="000000"/>
         </w:rPr>
-        <w:t> button lets you correct or update the saved name and password for an existing character. This is useful if:</w:t>
+        <w:t xml:space="preserve"> button lets you correct or update the saved name and password for an existing character. This is useful if:</w:t>
       </w:r>
     </w:p>
     <w:p>
@@ -21761,7 +20553,7 @@
           <w:rFonts w:ascii="Times New Roman" w:eastAsia="Times New Roman" w:hAnsi="Times New Roman" w:cs="Times New Roman"/>
           <w:color w:val="000000"/>
         </w:rPr>
-        <w:t>Select the character in the list and click </w:t>
+        <w:t xml:space="preserve">Select the character in the list and click </w:t>
       </w:r>
       <w:r>
         <w:rPr>
@@ -21856,7 +20648,7 @@
           <w:rFonts w:ascii="Times New Roman" w:eastAsia="Times New Roman" w:hAnsi="Times New Roman" w:cs="Times New Roman"/>
           <w:color w:val="000000"/>
         </w:rPr>
-        <w:t>Click the </w:t>
+        <w:t xml:space="preserve">Click the </w:t>
       </w:r>
       <w:r>
         <w:rPr>
@@ -21871,7 +20663,7 @@
           <w:rFonts w:ascii="Times New Roman" w:eastAsia="Times New Roman" w:hAnsi="Times New Roman" w:cs="Times New Roman"/>
           <w:color w:val="000000"/>
         </w:rPr>
-        <w:t> button.</w:t>
+        <w:t xml:space="preserve"> button.</w:t>
       </w:r>
     </w:p>
     <w:p>
@@ -22009,7 +20801,7 @@
         <w:rPr>
           <w:sz w:val="1"/>
         </w:rPr>
-        <w:br w:type="textWrapping" w:clear="all"/>
+        <w:br/>
       </w:r>
       <w:r>
         <w:rPr>

</xml_diff>